<commit_message>
Improve website appearance and performance across devices
Optimize CSS and HTML for better responsiveness and file size, and fix script loading order.

Replit-Commit-Author: Agent
Replit-Commit-Session-Id: 60da4e55-3e3e-4c14-a778-bc010fd00c2d
Replit-Commit-Checkpoint-Type: full_checkpoint
Replit-Commit-Event-Id: 8b557708-7b4d-4b2b-820e-cbad2588fa82
Replit-Commit-Screenshot-Url: https://storage.googleapis.com/screenshot-production-us-central1/35ecc3c8-b269-410e-ba9e-2756d5961cee/60da4e55-3e3e-4c14-a778-bc010fd00c2d/njjeaIM
</commit_message>
<xml_diff>
--- a/downloads/converted_Sajeda_Resume.docx
+++ b/downloads/converted_Sajeda_Resume.docx
@@ -4,1151 +4,3364 @@
   <w:body>
     <w:p>
       <w:pPr>
+        <w:autoSpaceDN w:val="0"/>
+        <w:autoSpaceDE w:val="0"/>
+        <w:widowControl/>
+        <w:spacing w:line="220" w:lineRule="exact" w:before="0" w:after="510"/>
+        <w:ind w:left="0" w:right="0"/>
+      </w:pPr>
+    </w:p>
+    <w:p>
+      <w:pPr>
+        <w:autoSpaceDN w:val="0"/>
+        <w:autoSpaceDE w:val="0"/>
+        <w:widowControl/>
+        <w:spacing w:line="248" w:lineRule="exact" w:before="18" w:after="0"/>
+        <w:ind w:left="432" w:right="432" w:firstLine="0"/>
         <w:jc w:val="center"/>
       </w:pPr>
       <w:r>
         <w:rPr>
+          <w:rFonts w:ascii="Times New Roman,Bold" w:hAnsi="Times New Roman,Bold" w:eastAsia="Times New Roman,Bold"/>
           <w:b/>
-          <w:sz w:val="32"/>
+          <w:i w:val="0"/>
+          <w:color w:val="000000"/>
+          <w:sz w:val="24"/>
         </w:rPr>
-        <w:t>Converted from PDF</w:t>
+        <w:t xml:space="preserve">SAJEDA SHAIKH </w:t>
+      </w:r>
+      <w:r>
+        <w:br/>
+      </w:r>
+      <w:r>
+        <w:rPr>
+          <w:rFonts w:ascii="Times New Roman" w:hAnsi="Times New Roman" w:eastAsia="Times New Roman"/>
+          <w:b w:val="0"/>
+          <w:i w:val="0"/>
+          <w:color w:val="000000"/>
+          <w:sz w:val="20"/>
+        </w:rPr>
+        <w:t>#229, 5</w:t>
+      </w:r>
+      <w:r>
+        <w:rPr>
+          <w:rFonts w:ascii="Times New Roman" w:hAnsi="Times New Roman" w:eastAsia="Times New Roman"/>
+          <w:b w:val="0"/>
+          <w:i w:val="0"/>
+          <w:color w:val="000000"/>
+          <w:sz w:val="13"/>
+        </w:rPr>
+        <w:t xml:space="preserve">th </w:t>
+      </w:r>
+      <w:r>
+        <w:rPr>
+          <w:rFonts w:ascii="Times New Roman" w:hAnsi="Times New Roman" w:eastAsia="Times New Roman"/>
+          <w:b w:val="0"/>
+          <w:i w:val="0"/>
+          <w:color w:val="000000"/>
+          <w:sz w:val="20"/>
+        </w:rPr>
+        <w:t>B Main, 2</w:t>
+      </w:r>
+      <w:r>
+        <w:rPr>
+          <w:rFonts w:ascii="Times New Roman" w:hAnsi="Times New Roman" w:eastAsia="Times New Roman"/>
+          <w:b w:val="0"/>
+          <w:i w:val="0"/>
+          <w:color w:val="000000"/>
+          <w:sz w:val="13"/>
+        </w:rPr>
+        <w:t>nd</w:t>
+      </w:r>
+      <w:r>
+        <w:rPr>
+          <w:rFonts w:ascii="Times New Roman" w:hAnsi="Times New Roman" w:eastAsia="Times New Roman"/>
+          <w:b w:val="0"/>
+          <w:i w:val="0"/>
+          <w:color w:val="000000"/>
+          <w:sz w:val="20"/>
+        </w:rPr>
+        <w:t xml:space="preserve"> Block, Near Banaswadi Traffic Police Station, Kalyan Nagar, Bangalore – 560043</w:t>
       </w:r>
     </w:p>
     <w:p>
       <w:pPr>
+        <w:autoSpaceDN w:val="0"/>
+        <w:autoSpaceDE w:val="0"/>
+        <w:widowControl/>
+        <w:spacing w:line="222" w:lineRule="exact" w:before="80" w:after="0"/>
+        <w:ind w:left="2074" w:right="0" w:firstLine="0"/>
+        <w:jc w:val="left"/>
+      </w:pPr>
+      <w:r>
+        <w:rPr>
+          <w:rFonts w:ascii="Times New Roman" w:hAnsi="Times New Roman" w:eastAsia="Times New Roman"/>
+          <w:b w:val="0"/>
+          <w:i w:val="0"/>
+          <w:color w:val="000000"/>
+          <w:sz w:val="20"/>
+        </w:rPr>
+        <w:t xml:space="preserve">Cell: +91-9662201971 | +91 – 9606151900 </w:t>
+      </w:r>
+      <w:r>
+        <w:rPr>
+          <w:rFonts w:ascii="Times New Roman" w:hAnsi="Times New Roman" w:eastAsia="Times New Roman"/>
+          <w:b w:val="0"/>
+          <w:i w:val="0"/>
+          <w:color w:val="000000"/>
+          <w:sz w:val="20"/>
+          <w:u w:val="single"/>
+        </w:rPr>
+        <w:t>sajoshaikh@gmail.com</w:t>
+      </w:r>
+    </w:p>
+    <w:p>
+      <w:pPr>
+        <w:autoSpaceDN w:val="0"/>
+        <w:autoSpaceDE w:val="0"/>
+        <w:widowControl/>
+        <w:spacing w:line="240" w:lineRule="auto" w:before="42" w:after="0"/>
+        <w:ind w:left="152" w:right="0" w:firstLine="0"/>
+        <w:jc w:val="left"/>
+      </w:pPr>
+      <w:r>
+        <w:drawing>
+          <wp:inline xmlns:a="http://schemas.openxmlformats.org/drawingml/2006/main" xmlns:pic="http://schemas.openxmlformats.org/drawingml/2006/picture">
+            <wp:extent cx="5781039" cy="218439"/>
+            <wp:docPr id="1" name="Picture 1"/>
+            <wp:cNvGraphicFramePr>
+              <a:graphicFrameLocks noChangeAspect="1"/>
+            </wp:cNvGraphicFramePr>
+            <a:graphic>
+              <a:graphicData uri="http://schemas.openxmlformats.org/drawingml/2006/picture">
+                <pic:pic>
+                  <pic:nvPicPr>
+                    <pic:cNvPr id="0" name="image.png"/>
+                    <pic:cNvPicPr/>
+                  </pic:nvPicPr>
+                  <pic:blipFill>
+                    <a:blip r:embed="rId9"/>
+                    <a:stretch>
+                      <a:fillRect/>
+                    </a:stretch>
+                  </pic:blipFill>
+                  <pic:spPr>
+                    <a:xfrm>
+                      <a:off x="0" y="0"/>
+                      <a:ext cx="5781039" cy="218439"/>
+                    </a:xfrm>
+                    <a:prstGeom prst="rect"/>
+                  </pic:spPr>
+                </pic:pic>
+              </a:graphicData>
+            </a:graphic>
+          </wp:inline>
+        </w:drawing>
+      </w:r>
+    </w:p>
+    <w:p>
+      <w:pPr>
+        <w:autoSpaceDN w:val="0"/>
+        <w:autoSpaceDE w:val="0"/>
+        <w:widowControl/>
+        <w:spacing w:line="260" w:lineRule="exact" w:before="40" w:after="0"/>
+        <w:ind w:left="160" w:right="720" w:hanging="14"/>
+        <w:jc w:val="left"/>
+      </w:pPr>
+      <w:r>
+        <w:rPr>
+          <w:rFonts w:ascii="Times New Roman,Bold" w:hAnsi="Times New Roman,Bold" w:eastAsia="Times New Roman,Bold"/>
+          <w:b/>
+          <w:i w:val="0"/>
+          <w:color w:val="000000"/>
+          <w:sz w:val="24"/>
+        </w:rPr>
+        <w:t xml:space="preserve">Professional Summary </w:t>
+      </w:r>
+      <w:r>
+        <w:br/>
+      </w:r>
+      <w:r>
+        <w:rPr>
+          <w:shd w:val="clear" w:color="auto" w:fill="fcfcfc"/>
+          <w:rFonts w:ascii="Times New Roman" w:hAnsi="Times New Roman" w:eastAsia="Times New Roman"/>
+          <w:b w:val="0"/>
+          <w:i w:val="0"/>
+          <w:color w:val="000000"/>
+          <w:sz w:val="20"/>
+        </w:rPr>
+        <w:t>Travel consultant experienced in the design and supervision of travel arrangements for business users,</w:t>
+      </w:r>
+      <w:r>
+        <w:rPr>
+          <w:rFonts w:ascii="Times New Roman" w:hAnsi="Times New Roman" w:eastAsia="Times New Roman"/>
+          <w:b w:val="0"/>
+          <w:i w:val="0"/>
+          <w:color w:val="000000"/>
+          <w:sz w:val="20"/>
+        </w:rPr>
+        <w:t xml:space="preserve"> </w:t>
+      </w:r>
+      <w:r>
+        <w:rPr>
+          <w:shd w:val="clear" w:color="auto" w:fill="fcfcfc"/>
+          <w:rFonts w:ascii="Times New Roman" w:hAnsi="Times New Roman" w:eastAsia="Times New Roman"/>
+          <w:b w:val="0"/>
+          <w:i w:val="0"/>
+          <w:color w:val="000000"/>
+          <w:sz w:val="20"/>
+        </w:rPr>
+        <w:t>Individuals, and couples. Ready to use network of resources to find clients the best and most affordable</w:t>
+      </w:r>
+      <w:r>
+        <w:rPr>
+          <w:rFonts w:ascii="Times New Roman" w:hAnsi="Times New Roman" w:eastAsia="Times New Roman"/>
+          <w:b w:val="0"/>
+          <w:i w:val="0"/>
+          <w:color w:val="000000"/>
+          <w:sz w:val="20"/>
+        </w:rPr>
+        <w:t xml:space="preserve"> </w:t>
+      </w:r>
+      <w:r>
+        <w:rPr>
+          <w:shd w:val="clear" w:color="auto" w:fill="fcfcfc"/>
+          <w:rFonts w:ascii="Times New Roman" w:hAnsi="Times New Roman" w:eastAsia="Times New Roman"/>
+          <w:b w:val="0"/>
+          <w:i w:val="0"/>
+          <w:color w:val="000000"/>
+          <w:sz w:val="20"/>
+        </w:rPr>
+        <w:t>accommodations in lodgings flights meals and business spaces.</w:t>
+      </w:r>
+      <w:r>
+        <w:rPr>
+          <w:rFonts w:ascii="Times New Roman" w:hAnsi="Times New Roman" w:eastAsia="Times New Roman"/>
+          <w:b w:val="0"/>
+          <w:i w:val="0"/>
+          <w:color w:val="000000"/>
+          <w:sz w:val="20"/>
+        </w:rPr>
+        <w:t xml:space="preserve"> </w:t>
+      </w:r>
+    </w:p>
+    <w:p>
+      <w:pPr>
+        <w:autoSpaceDN w:val="0"/>
+        <w:autoSpaceDE w:val="0"/>
+        <w:widowControl/>
+        <w:spacing w:line="240" w:lineRule="auto" w:before="270" w:after="52"/>
+        <w:ind w:left="0" w:right="0" w:firstLine="0"/>
+        <w:jc w:val="center"/>
+      </w:pPr>
+      <w:r>
+        <w:drawing>
+          <wp:inline xmlns:a="http://schemas.openxmlformats.org/drawingml/2006/main" xmlns:pic="http://schemas.openxmlformats.org/drawingml/2006/picture">
+            <wp:extent cx="5777230" cy="129539"/>
+            <wp:docPr id="2" name="Picture 2"/>
+            <wp:cNvGraphicFramePr>
+              <a:graphicFrameLocks noChangeAspect="1"/>
+            </wp:cNvGraphicFramePr>
+            <a:graphic>
+              <a:graphicData uri="http://schemas.openxmlformats.org/drawingml/2006/picture">
+                <pic:pic>
+                  <pic:nvPicPr>
+                    <pic:cNvPr id="0" name="image.png"/>
+                    <pic:cNvPicPr/>
+                  </pic:nvPicPr>
+                  <pic:blipFill>
+                    <a:blip r:embed="rId10"/>
+                    <a:stretch>
+                      <a:fillRect/>
+                    </a:stretch>
+                  </pic:blipFill>
+                  <pic:spPr>
+                    <a:xfrm>
+                      <a:off x="0" y="0"/>
+                      <a:ext cx="5777230" cy="129539"/>
+                    </a:xfrm>
+                    <a:prstGeom prst="rect"/>
+                  </pic:spPr>
+                </pic:pic>
+              </a:graphicData>
+            </a:graphic>
+          </wp:inline>
+        </w:drawing>
+      </w:r>
+    </w:p>
+    <w:tbl>
+      <w:tblPr>
+        <w:tblW w:type="auto" w:w="0"/>
+        <w:tblLayout w:type="fixed"/>
+        <w:tblLook w:firstColumn="1" w:firstRow="1" w:lastColumn="0" w:lastRow="0" w:noHBand="0" w:noVBand="1" w:val="04A0"/>
+        <w:tblInd w:w="0.0" w:type="dxa"/>
+      </w:tblPr>
+      <w:tblGrid>
+        <w:gridCol w:w="4647"/>
+        <w:gridCol w:w="4647"/>
+      </w:tblGrid>
+      <w:tr>
+        <w:trPr>
+          <w:trHeight w:hRule="exact" w:val="374"/>
+        </w:trPr>
+        <w:tc>
+          <w:tcPr>
+            <w:tcW w:type="dxa" w:w="9220"/>
+            <w:gridSpan w:val="2"/>
+            <w:tcBorders/>
+            <w:shd w:fill="fcfcfc"/>
+            <w:tcMar>
+              <w:start w:w="0" w:type="dxa"/>
+              <w:end w:w="0" w:type="dxa"/>
+            </w:tcMar>
+            <w:tcMar>
+              <w:start w:w="0" w:type="dxa"/>
+              <w:end w:w="0" w:type="dxa"/>
+            </w:tcMar>
+          </w:tcPr>
+          <w:p>
+            <w:pPr>
+              <w:autoSpaceDN w:val="0"/>
+              <w:autoSpaceDE w:val="0"/>
+              <w:widowControl/>
+              <w:spacing w:line="266" w:lineRule="exact" w:before="100" w:after="0"/>
+              <w:ind w:left="146" w:right="0" w:firstLine="0"/>
+              <w:jc w:val="left"/>
+            </w:pPr>
+            <w:r>
+              <w:rPr>
+                <w:rFonts w:ascii="Times New Roman,Bold" w:hAnsi="Times New Roman,Bold" w:eastAsia="Times New Roman,Bold"/>
+                <w:b/>
+                <w:i w:val="0"/>
+                <w:color w:val="000000"/>
+                <w:sz w:val="24"/>
+              </w:rPr>
+              <w:t xml:space="preserve">Core Qualifications </w:t>
+            </w:r>
+          </w:p>
+        </w:tc>
+      </w:tr>
+      <w:tr>
+        <w:trPr>
+          <w:trHeight w:hRule="exact" w:val="260"/>
+        </w:trPr>
+        <w:tc>
+          <w:tcPr>
+            <w:tcW w:type="dxa" w:w="620"/>
+            <w:tcBorders/>
+            <w:shd w:fill="fcfcfc"/>
+            <w:tcMar>
+              <w:start w:w="0" w:type="dxa"/>
+              <w:end w:w="0" w:type="dxa"/>
+            </w:tcMar>
+          </w:tcPr>
+          <w:p>
+            <w:pPr>
+              <w:autoSpaceDN w:val="0"/>
+              <w:autoSpaceDE w:val="0"/>
+              <w:widowControl/>
+              <w:spacing w:line="233" w:lineRule="auto" w:before="16" w:after="0"/>
+              <w:ind w:left="0" w:right="108" w:firstLine="0"/>
+              <w:jc w:val="right"/>
+            </w:pPr>
+            <w:r>
+              <w:rPr>
+                <w:rFonts w:ascii="Arial" w:hAnsi="Arial" w:eastAsia="Arial"/>
+                <w:b w:val="0"/>
+                <w:i w:val="0"/>
+                <w:color w:val="000000"/>
+                <w:sz w:val="20"/>
+              </w:rPr>
+              <w:t xml:space="preserve">• </w:t>
+            </w:r>
+          </w:p>
+        </w:tc>
+        <w:tc>
+          <w:tcPr>
+            <w:tcW w:type="dxa" w:w="8600"/>
+            <w:tcBorders/>
+            <w:shd w:fill="fcfcfc"/>
+            <w:tcMar>
+              <w:start w:w="0" w:type="dxa"/>
+              <w:end w:w="0" w:type="dxa"/>
+            </w:tcMar>
+          </w:tcPr>
+          <w:p>
+            <w:pPr>
+              <w:autoSpaceDN w:val="0"/>
+              <w:autoSpaceDE w:val="0"/>
+              <w:widowControl/>
+              <w:spacing w:line="222" w:lineRule="exact" w:before="18" w:after="0"/>
+              <w:ind w:left="126" w:right="0" w:firstLine="0"/>
+              <w:jc w:val="left"/>
+            </w:pPr>
+            <w:r>
+              <w:rPr>
+                <w:rFonts w:ascii="Times New Roman" w:hAnsi="Times New Roman" w:eastAsia="Times New Roman"/>
+                <w:b w:val="0"/>
+                <w:i w:val="0"/>
+                <w:color w:val="000000"/>
+                <w:sz w:val="20"/>
+              </w:rPr>
+              <w:t xml:space="preserve">Extensive background in travel practices with a leaning toward corporate needs </w:t>
+            </w:r>
+          </w:p>
+        </w:tc>
+      </w:tr>
+      <w:tr>
+        <w:trPr>
+          <w:trHeight w:hRule="exact" w:val="260"/>
+        </w:trPr>
+        <w:tc>
+          <w:tcPr>
+            <w:tcW w:type="dxa" w:w="620"/>
+            <w:tcBorders/>
+            <w:shd w:fill="fcfcfc"/>
+            <w:tcMar>
+              <w:start w:w="0" w:type="dxa"/>
+              <w:end w:w="0" w:type="dxa"/>
+            </w:tcMar>
+          </w:tcPr>
+          <w:p>
+            <w:pPr>
+              <w:autoSpaceDN w:val="0"/>
+              <w:autoSpaceDE w:val="0"/>
+              <w:widowControl/>
+              <w:spacing w:line="235" w:lineRule="auto" w:before="24" w:after="0"/>
+              <w:ind w:left="0" w:right="108" w:firstLine="0"/>
+              <w:jc w:val="right"/>
+            </w:pPr>
+            <w:r>
+              <w:rPr>
+                <w:rFonts w:ascii="Arial" w:hAnsi="Arial" w:eastAsia="Arial"/>
+                <w:b w:val="0"/>
+                <w:i w:val="0"/>
+                <w:color w:val="000000"/>
+                <w:sz w:val="20"/>
+              </w:rPr>
+              <w:t xml:space="preserve">• </w:t>
+            </w:r>
+          </w:p>
+        </w:tc>
+        <w:tc>
+          <w:tcPr>
+            <w:tcW w:type="dxa" w:w="8600"/>
+            <w:tcBorders/>
+            <w:shd w:fill="fcfcfc"/>
+            <w:tcMar>
+              <w:start w:w="0" w:type="dxa"/>
+              <w:end w:w="0" w:type="dxa"/>
+            </w:tcMar>
+          </w:tcPr>
+          <w:p>
+            <w:pPr>
+              <w:autoSpaceDN w:val="0"/>
+              <w:autoSpaceDE w:val="0"/>
+              <w:widowControl/>
+              <w:spacing w:line="220" w:lineRule="exact" w:before="28" w:after="0"/>
+              <w:ind w:left="126" w:right="0" w:firstLine="0"/>
+              <w:jc w:val="left"/>
+            </w:pPr>
+            <w:r>
+              <w:rPr>
+                <w:rFonts w:ascii="Times New Roman" w:hAnsi="Times New Roman" w:eastAsia="Times New Roman"/>
+                <w:b w:val="0"/>
+                <w:i w:val="0"/>
+                <w:color w:val="000000"/>
+                <w:sz w:val="20"/>
+              </w:rPr>
+              <w:t xml:space="preserve">Strong network of resources ready to provide specific business trip requirements </w:t>
+            </w:r>
+          </w:p>
+        </w:tc>
+      </w:tr>
+      <w:tr>
+        <w:trPr>
+          <w:trHeight w:hRule="exact" w:val="260"/>
+        </w:trPr>
+        <w:tc>
+          <w:tcPr>
+            <w:tcW w:type="dxa" w:w="620"/>
+            <w:tcBorders/>
+            <w:shd w:fill="fcfcfc"/>
+            <w:tcMar>
+              <w:start w:w="0" w:type="dxa"/>
+              <w:end w:w="0" w:type="dxa"/>
+            </w:tcMar>
+          </w:tcPr>
+          <w:p>
+            <w:pPr>
+              <w:autoSpaceDN w:val="0"/>
+              <w:autoSpaceDE w:val="0"/>
+              <w:widowControl/>
+              <w:spacing w:line="233" w:lineRule="auto" w:before="32" w:after="0"/>
+              <w:ind w:left="0" w:right="108" w:firstLine="0"/>
+              <w:jc w:val="right"/>
+            </w:pPr>
+            <w:r>
+              <w:rPr>
+                <w:rFonts w:ascii="Arial" w:hAnsi="Arial" w:eastAsia="Arial"/>
+                <w:b w:val="0"/>
+                <w:i w:val="0"/>
+                <w:color w:val="000000"/>
+                <w:sz w:val="20"/>
+              </w:rPr>
+              <w:t xml:space="preserve">• </w:t>
+            </w:r>
+          </w:p>
+        </w:tc>
+        <w:tc>
+          <w:tcPr>
+            <w:tcW w:type="dxa" w:w="8600"/>
+            <w:tcBorders/>
+            <w:shd w:fill="fcfcfc"/>
+            <w:tcMar>
+              <w:start w:w="0" w:type="dxa"/>
+              <w:end w:w="0" w:type="dxa"/>
+            </w:tcMar>
+          </w:tcPr>
+          <w:p>
+            <w:pPr>
+              <w:autoSpaceDN w:val="0"/>
+              <w:autoSpaceDE w:val="0"/>
+              <w:widowControl/>
+              <w:spacing w:line="222" w:lineRule="exact" w:before="34" w:after="0"/>
+              <w:ind w:left="126" w:right="0" w:firstLine="0"/>
+              <w:jc w:val="left"/>
+            </w:pPr>
+            <w:r>
+              <w:rPr>
+                <w:rFonts w:ascii="Times New Roman" w:hAnsi="Times New Roman" w:eastAsia="Times New Roman"/>
+                <w:b w:val="0"/>
+                <w:i w:val="0"/>
+                <w:color w:val="000000"/>
+                <w:sz w:val="20"/>
+              </w:rPr>
+              <w:t xml:space="preserve">Can arrange travel by air, rail, road, boat etc. </w:t>
+            </w:r>
+          </w:p>
+        </w:tc>
+      </w:tr>
+      <w:tr>
+        <w:trPr>
+          <w:trHeight w:hRule="exact" w:val="282"/>
+        </w:trPr>
+        <w:tc>
+          <w:tcPr>
+            <w:tcW w:type="dxa" w:w="620"/>
+            <w:tcBorders/>
+            <w:shd w:fill="fcfcfc"/>
+            <w:tcMar>
+              <w:start w:w="0" w:type="dxa"/>
+              <w:end w:w="0" w:type="dxa"/>
+            </w:tcMar>
+          </w:tcPr>
+          <w:p>
+            <w:pPr>
+              <w:autoSpaceDN w:val="0"/>
+              <w:autoSpaceDE w:val="0"/>
+              <w:widowControl/>
+              <w:spacing w:line="233" w:lineRule="auto" w:before="40" w:after="0"/>
+              <w:ind w:left="0" w:right="108" w:firstLine="0"/>
+              <w:jc w:val="right"/>
+            </w:pPr>
+            <w:r>
+              <w:rPr>
+                <w:rFonts w:ascii="Arial" w:hAnsi="Arial" w:eastAsia="Arial"/>
+                <w:b w:val="0"/>
+                <w:i w:val="0"/>
+                <w:color w:val="000000"/>
+                <w:sz w:val="20"/>
+              </w:rPr>
+              <w:t xml:space="preserve">• </w:t>
+            </w:r>
+          </w:p>
+        </w:tc>
+        <w:tc>
+          <w:tcPr>
+            <w:tcW w:type="dxa" w:w="8600"/>
+            <w:tcBorders/>
+            <w:shd w:fill="fcfcfc"/>
+            <w:tcMar>
+              <w:start w:w="0" w:type="dxa"/>
+              <w:end w:w="0" w:type="dxa"/>
+            </w:tcMar>
+          </w:tcPr>
+          <w:p>
+            <w:pPr>
+              <w:autoSpaceDN w:val="0"/>
+              <w:autoSpaceDE w:val="0"/>
+              <w:widowControl/>
+              <w:spacing w:line="220" w:lineRule="exact" w:before="44" w:after="0"/>
+              <w:ind w:left="0" w:right="0" w:firstLine="0"/>
+              <w:jc w:val="center"/>
+            </w:pPr>
+            <w:r>
+              <w:rPr>
+                <w:rFonts w:ascii="Times New Roman" w:hAnsi="Times New Roman" w:eastAsia="Times New Roman"/>
+                <w:b w:val="0"/>
+                <w:i w:val="0"/>
+                <w:color w:val="000000"/>
+                <w:sz w:val="20"/>
+              </w:rPr>
+              <w:t xml:space="preserve">Understanding of practices associated with reading defining and application of taxes hub utilization and </w:t>
+            </w:r>
+          </w:p>
+        </w:tc>
+      </w:tr>
+    </w:tbl>
+    <w:p>
+      <w:pPr>
+        <w:autoSpaceDN w:val="0"/>
+        <w:autoSpaceDE w:val="0"/>
+        <w:widowControl/>
+        <w:spacing w:line="20" w:lineRule="exact" w:before="0" w:after="0"/>
+        <w:ind w:left="0" w:right="0"/>
+      </w:pPr>
+    </w:p>
+    <w:tbl>
+      <w:tblPr>
+        <w:tblW w:type="auto" w:w="0"/>
+        <w:tblLayout w:type="fixed"/>
+        <w:tblLook w:firstColumn="1" w:firstRow="1" w:lastColumn="0" w:lastRow="0" w:noHBand="0" w:noVBand="1" w:val="04A0"/>
+        <w:tblInd w:w="180.0" w:type="dxa"/>
+      </w:tblPr>
+      <w:tblGrid>
+        <w:gridCol w:w="4647"/>
+        <w:gridCol w:w="4647"/>
+      </w:tblGrid>
+      <w:tr>
+        <w:trPr>
+          <w:trHeight w:hRule="exact" w:val="834"/>
+        </w:trPr>
+        <w:tc>
+          <w:tcPr>
+            <w:tcW w:type="dxa" w:w="440"/>
+            <w:tcBorders/>
+            <w:shd w:fill="fcfcfc"/>
+            <w:tcMar>
+              <w:start w:w="0" w:type="dxa"/>
+              <w:end w:w="0" w:type="dxa"/>
+            </w:tcMar>
+          </w:tcPr>
+          <w:p>
+            <w:pPr>
+              <w:autoSpaceDN w:val="0"/>
+              <w:autoSpaceDE w:val="0"/>
+              <w:widowControl/>
+              <w:spacing w:line="257" w:lineRule="auto" w:before="284" w:after="0"/>
+              <w:ind w:left="144" w:right="108" w:firstLine="0"/>
+              <w:jc w:val="right"/>
+            </w:pPr>
+            <w:r>
+              <w:rPr>
+                <w:rFonts w:ascii="Arial" w:hAnsi="Arial" w:eastAsia="Arial"/>
+                <w:b w:val="0"/>
+                <w:i w:val="0"/>
+                <w:color w:val="000000"/>
+                <w:sz w:val="20"/>
+              </w:rPr>
+              <w:t xml:space="preserve">• </w:t>
+            </w:r>
+            <w:r>
+              <w:br/>
+            </w:r>
+            <w:r>
+              <w:rPr>
+                <w:rFonts w:ascii="Arial" w:hAnsi="Arial" w:eastAsia="Arial"/>
+                <w:b w:val="0"/>
+                <w:i w:val="0"/>
+                <w:color w:val="000000"/>
+                <w:sz w:val="20"/>
+              </w:rPr>
+              <w:t xml:space="preserve">• </w:t>
+            </w:r>
+          </w:p>
+        </w:tc>
+        <w:tc>
+          <w:tcPr>
+            <w:tcW w:type="dxa" w:w="8220"/>
+            <w:tcBorders/>
+            <w:shd w:fill="fcfcfc"/>
+            <w:tcMar>
+              <w:start w:w="0" w:type="dxa"/>
+              <w:end w:w="0" w:type="dxa"/>
+            </w:tcMar>
+          </w:tcPr>
+          <w:p>
+            <w:pPr>
+              <w:autoSpaceDN w:val="0"/>
+              <w:autoSpaceDE w:val="0"/>
+              <w:widowControl/>
+              <w:spacing w:line="258" w:lineRule="exact" w:before="0" w:after="0"/>
+              <w:ind w:left="126" w:right="432" w:firstLine="0"/>
+              <w:jc w:val="left"/>
+            </w:pPr>
+            <w:r>
+              <w:rPr>
+                <w:rFonts w:ascii="Times New Roman" w:hAnsi="Times New Roman" w:eastAsia="Times New Roman"/>
+                <w:b w:val="0"/>
+                <w:i w:val="0"/>
+                <w:color w:val="000000"/>
+                <w:sz w:val="20"/>
+              </w:rPr>
+              <w:t xml:space="preserve">fare rules </w:t>
+            </w:r>
+            <w:r>
+              <w:br/>
+            </w:r>
+            <w:r>
+              <w:rPr>
+                <w:rFonts w:ascii="Times New Roman" w:hAnsi="Times New Roman" w:eastAsia="Times New Roman"/>
+                <w:b w:val="0"/>
+                <w:i w:val="0"/>
+                <w:color w:val="000000"/>
+                <w:sz w:val="20"/>
+              </w:rPr>
+              <w:t xml:space="preserve">Capable of providing the best accommodations while staying within a projected budget </w:t>
+            </w:r>
+            <w:r>
+              <w:rPr>
+                <w:rFonts w:ascii="Times New Roman" w:hAnsi="Times New Roman" w:eastAsia="Times New Roman"/>
+                <w:b w:val="0"/>
+                <w:i w:val="0"/>
+                <w:color w:val="000000"/>
+                <w:sz w:val="20"/>
+              </w:rPr>
+              <w:t xml:space="preserve">Excellent oral and written communication skills ensuring all parties are appropriately informed </w:t>
+            </w:r>
+          </w:p>
+        </w:tc>
+      </w:tr>
+    </w:tbl>
+    <w:p>
+      <w:pPr>
+        <w:autoSpaceDN w:val="0"/>
+        <w:autoSpaceDE w:val="0"/>
+        <w:widowControl/>
+        <w:spacing w:line="226" w:lineRule="exact" w:before="0" w:after="0"/>
+        <w:ind w:left="0" w:right="0"/>
+      </w:pPr>
+    </w:p>
+    <w:tbl>
+      <w:tblPr>
+        <w:tblW w:type="auto" w:w="0"/>
+        <w:tblLayout w:type="fixed"/>
+        <w:tblLook w:firstColumn="1" w:firstRow="1" w:lastColumn="0" w:lastRow="0" w:noHBand="0" w:noVBand="1" w:val="04A0"/>
+        <w:tblInd w:w="40.0" w:type="dxa"/>
+      </w:tblPr>
+      <w:tblGrid>
+        <w:gridCol w:w="9294"/>
+      </w:tblGrid>
+      <w:tr>
+        <w:trPr>
+          <w:trHeight w:hRule="exact" w:val="306"/>
+        </w:trPr>
+        <w:tc>
+          <w:tcPr>
+            <w:tcW w:type="dxa" w:w="9200"/>
+            <w:tcBorders/>
+            <w:shd w:fill="fcfcfc"/>
+            <w:tcMar>
+              <w:start w:w="0" w:type="dxa"/>
+              <w:end w:w="0" w:type="dxa"/>
+            </w:tcMar>
+          </w:tcPr>
+          <w:p>
+            <w:pPr>
+              <w:autoSpaceDN w:val="0"/>
+              <w:autoSpaceDE w:val="0"/>
+              <w:widowControl/>
+              <w:spacing w:line="240" w:lineRule="auto" w:before="60" w:after="0"/>
+              <w:ind w:left="0" w:right="0" w:firstLine="0"/>
+              <w:jc w:val="center"/>
+            </w:pPr>
+            <w:r>
+              <w:drawing>
+                <wp:inline xmlns:a="http://schemas.openxmlformats.org/drawingml/2006/main" xmlns:pic="http://schemas.openxmlformats.org/drawingml/2006/picture">
+                  <wp:extent cx="5786120" cy="130809"/>
+                  <wp:docPr id="3" name="Picture 3"/>
+                  <wp:cNvGraphicFramePr>
+                    <a:graphicFrameLocks noChangeAspect="1"/>
+                  </wp:cNvGraphicFramePr>
+                  <a:graphic>
+                    <a:graphicData uri="http://schemas.openxmlformats.org/drawingml/2006/picture">
+                      <pic:pic>
+                        <pic:nvPicPr>
+                          <pic:cNvPr id="0" name="image.png"/>
+                          <pic:cNvPicPr/>
+                        </pic:nvPicPr>
+                        <pic:blipFill>
+                          <a:blip r:embed="rId11"/>
+                          <a:stretch>
+                            <a:fillRect/>
+                          </a:stretch>
+                        </pic:blipFill>
+                        <pic:spPr>
+                          <a:xfrm>
+                            <a:off x="0" y="0"/>
+                            <a:ext cx="5786120" cy="130809"/>
+                          </a:xfrm>
+                          <a:prstGeom prst="rect"/>
+                        </pic:spPr>
+                      </pic:pic>
+                    </a:graphicData>
+                  </a:graphic>
+                </wp:inline>
+              </w:drawing>
+            </w:r>
+          </w:p>
+        </w:tc>
+      </w:tr>
+    </w:tbl>
+    <w:p>
+      <w:pPr>
+        <w:autoSpaceDN w:val="0"/>
+        <w:autoSpaceDE w:val="0"/>
+        <w:widowControl/>
+        <w:spacing w:line="20" w:lineRule="exact" w:before="0" w:after="0"/>
+        <w:ind w:left="0" w:right="0"/>
+      </w:pPr>
+    </w:p>
+    <w:tbl>
+      <w:tblPr>
+        <w:tblW w:type="auto" w:w="0"/>
+        <w:tblLayout w:type="fixed"/>
+        <w:tblLook w:firstColumn="1" w:firstRow="1" w:lastColumn="0" w:lastRow="0" w:noHBand="0" w:noVBand="1" w:val="04A0"/>
+        <w:tblInd w:w="0.0" w:type="dxa"/>
+      </w:tblPr>
+      <w:tblGrid>
+        <w:gridCol w:w="9294"/>
+      </w:tblGrid>
+      <w:tr>
+        <w:trPr>
+          <w:trHeight w:hRule="exact" w:val="296"/>
+        </w:trPr>
+        <w:tc>
+          <w:tcPr>
+            <w:tcW w:type="dxa" w:w="5240"/>
+            <w:tcBorders/>
+            <w:shd w:fill="fcfcfc"/>
+            <w:tcMar>
+              <w:start w:w="0" w:type="dxa"/>
+              <w:end w:w="0" w:type="dxa"/>
+            </w:tcMar>
+          </w:tcPr>
+          <w:p>
+            <w:pPr>
+              <w:autoSpaceDN w:val="0"/>
+              <w:autoSpaceDE w:val="0"/>
+              <w:widowControl/>
+              <w:spacing w:line="266" w:lineRule="exact" w:before="42" w:after="0"/>
+              <w:ind w:left="12" w:right="0" w:firstLine="0"/>
+              <w:jc w:val="left"/>
+            </w:pPr>
+            <w:r>
+              <w:rPr>
+                <w:rFonts w:ascii="Times New Roman,Bold" w:hAnsi="Times New Roman,Bold" w:eastAsia="Times New Roman,Bold"/>
+                <w:b/>
+                <w:i w:val="0"/>
+                <w:color w:val="000000"/>
+                <w:sz w:val="24"/>
+              </w:rPr>
+              <w:t xml:space="preserve">Experience </w:t>
+            </w:r>
+          </w:p>
+        </w:tc>
+      </w:tr>
+    </w:tbl>
+    <w:p>
+      <w:pPr>
+        <w:autoSpaceDN w:val="0"/>
+        <w:autoSpaceDE w:val="0"/>
+        <w:widowControl/>
+        <w:spacing w:line="14" w:lineRule="exact" w:before="0" w:after="0"/>
+        <w:ind w:left="0" w:right="0"/>
+      </w:pPr>
+    </w:p>
+    <w:p>
+      <w:pPr>
+        <w:autoSpaceDN w:val="0"/>
+        <w:autoSpaceDE w:val="0"/>
+        <w:widowControl/>
+        <w:spacing w:line="14" w:lineRule="exact" w:before="0" w:after="0"/>
+        <w:ind w:left="0" w:right="0"/>
+      </w:pPr>
+    </w:p>
+    <w:p>
+      <w:pPr>
+        <w:autoSpaceDN w:val="0"/>
+        <w:autoSpaceDE w:val="0"/>
+        <w:widowControl/>
+        <w:spacing w:line="14" w:lineRule="exact" w:before="0" w:after="0"/>
+        <w:ind w:left="0" w:right="0"/>
+      </w:pPr>
+    </w:p>
+    <w:p>
+      <w:pPr>
+        <w:autoSpaceDN w:val="0"/>
+        <w:autoSpaceDE w:val="0"/>
+        <w:widowControl/>
+        <w:spacing w:line="14" w:lineRule="exact" w:before="0" w:after="14"/>
+        <w:ind w:left="0" w:right="0"/>
+      </w:pPr>
+    </w:p>
+    <w:p>
+      <w:pPr>
+        <w:sectPr>
+          <w:pgSz w:w="11906" w:h="16838"/>
+          <w:pgMar w:top="730" w:right="1332" w:bottom="1440" w:left="1280" w:header="720" w:footer="720" w:gutter="0"/>
+          <w:cols/>
+          <w:docGrid w:linePitch="360"/>
+        </w:sectPr>
+      </w:pPr>
+    </w:p>
+    <w:p>
+      <w:pPr>
+        <w:autoSpaceDN w:val="0"/>
+        <w:autoSpaceDE w:val="0"/>
+        <w:widowControl/>
+        <w:spacing w:line="260" w:lineRule="exact" w:before="0" w:after="0"/>
+        <w:ind w:left="0" w:right="2448" w:firstLine="0"/>
         <w:jc w:val="center"/>
       </w:pPr>
       <w:r>
         <w:rPr>
-          <w:i/>
-          <w:sz w:val="20"/>
+          <w:rFonts w:ascii="Times New Roman,Bold" w:hAnsi="Times New Roman,Bold" w:eastAsia="Times New Roman,Bold"/>
+          <w:b/>
+          <w:i w:val="0"/>
+          <w:color w:val="000000"/>
+          <w:sz w:val="22"/>
         </w:rPr>
-        <w:t>Source: 9a1d75fe46147f4bec2dc42e2b1617a0</w:t>
+        <w:t xml:space="preserve">Operations Manager </w:t>
       </w:r>
-    </w:p>
-    <w:p>
       <w:r>
-        <w:t>==================================================</w:t>
+        <w:br/>
+      </w:r>
+      <w:r>
+        <w:rPr>
+          <w:rFonts w:ascii="Times New Roman,Bold" w:hAnsi="Times New Roman,Bold" w:eastAsia="Times New Roman,Bold"/>
+          <w:b/>
+          <w:i w:val="0"/>
+          <w:color w:val="000000"/>
+          <w:sz w:val="22"/>
+        </w:rPr>
+        <w:t xml:space="preserve">Traventions Pvt Ltd </w:t>
       </w:r>
     </w:p>
     <w:p>
       <w:pPr>
+        <w:sectPr>
+          <w:type w:val="continuous"/>
+          <w:pgSz w:w="11906" w:h="16838"/>
+          <w:pgMar w:top="730" w:right="1332" w:bottom="1440" w:left="1280" w:header="720" w:footer="720" w:gutter="0"/>
+          <w:cols w:num="2" w:equalWidth="0">
+            <w:col w:w="4508" w:space="0"/>
+            <w:col w:w="4786" w:space="0"/>
+          </w:cols>
+          <w:docGrid w:linePitch="360"/>
+        </w:sectPr>
+      </w:pPr>
+    </w:p>
+    <w:p>
+      <w:pPr>
+        <w:autoSpaceDN w:val="0"/>
+        <w:autoSpaceDE w:val="0"/>
+        <w:widowControl/>
+        <w:spacing w:line="252" w:lineRule="exact" w:before="0" w:after="292"/>
+        <w:ind w:left="0" w:right="108" w:firstLine="0"/>
+        <w:jc w:val="right"/>
+      </w:pPr>
+      <w:r>
+        <w:rPr>
+          <w:rFonts w:ascii="Times New Roman,Bold" w:hAnsi="Times New Roman,Bold" w:eastAsia="Times New Roman,Bold"/>
+          <w:b/>
+          <w:i w:val="0"/>
+          <w:color w:val="000000"/>
+          <w:sz w:val="22"/>
+        </w:rPr>
+        <w:t>21</w:t>
+      </w:r>
+      <w:r>
+        <w:rPr>
+          <w:rFonts w:ascii="Times New Roman,Bold" w:hAnsi="Times New Roman,Bold" w:eastAsia="Times New Roman,Bold"/>
+          <w:b/>
+          <w:i w:val="0"/>
+          <w:color w:val="000000"/>
+          <w:sz w:val="14"/>
+        </w:rPr>
+        <w:t>st</w:t>
+      </w:r>
+      <w:r>
+        <w:rPr>
+          <w:rFonts w:ascii="Times New Roman,Bold" w:hAnsi="Times New Roman,Bold" w:eastAsia="Times New Roman,Bold"/>
+          <w:b/>
+          <w:i w:val="0"/>
+          <w:color w:val="000000"/>
+          <w:sz w:val="22"/>
+        </w:rPr>
+        <w:t xml:space="preserve"> Oct 2024 – Present </w:t>
+      </w:r>
+    </w:p>
+    <w:p>
+      <w:pPr>
+        <w:sectPr>
+          <w:type w:val="nextColumn"/>
+          <w:pgSz w:w="11906" w:h="16838"/>
+          <w:pgMar w:top="730" w:right="1332" w:bottom="1440" w:left="1280" w:header="720" w:footer="720" w:gutter="0"/>
+          <w:cols w:num="2" w:equalWidth="0">
+            <w:col w:w="4508" w:space="0"/>
+            <w:col w:w="4786" w:space="0"/>
+          </w:cols>
+          <w:docGrid w:linePitch="360"/>
+        </w:sectPr>
+      </w:pPr>
+    </w:p>
+    <w:p>
+      <w:pPr>
+        <w:autoSpaceDN w:val="0"/>
+        <w:tabs>
+          <w:tab w:pos="732" w:val="left"/>
+        </w:tabs>
+        <w:autoSpaceDE w:val="0"/>
+        <w:widowControl/>
+        <w:spacing w:line="240" w:lineRule="exact" w:before="0" w:after="0"/>
+        <w:ind w:left="372" w:right="576" w:firstLine="0"/>
         <w:jc w:val="left"/>
       </w:pPr>
       <w:r>
         <w:rPr>
-          <w:b/>
-          <w:sz w:val="28"/>
+          <w:rFonts w:ascii="Arial" w:hAnsi="Arial" w:eastAsia="Arial"/>
+          <w:b w:val="0"/>
+          <w:i w:val="0"/>
+          <w:color w:val="000000"/>
+          <w:sz w:val="20"/>
         </w:rPr>
-        <w:t>SAJEDA SHAIKH</w:t>
+        <w:t xml:space="preserve">• </w:t>
       </w:r>
-    </w:p>
-    <w:p>
+      <w:r>
+        <w:tab/>
+      </w:r>
       <w:r>
         <w:rPr>
-          <w:sz w:val="24"/>
+          <w:rFonts w:ascii="Times New Roman" w:hAnsi="Times New Roman" w:eastAsia="Times New Roman"/>
+          <w:b w:val="0"/>
+          <w:i w:val="0"/>
+          <w:color w:val="000000"/>
+          <w:sz w:val="20"/>
         </w:rPr>
-        <w:t>#229, 5 th B Main, 2 nd Block, Near Banaswadi Traffic Police Station, Kalyan Nagar, Bangalore – 560043</w:t>
+        <w:t xml:space="preserve">Serving as the </w:t>
       </w:r>
-    </w:p>
-    <w:p>
       <w:r>
         <w:rPr>
-          <w:sz w:val="24"/>
+          <w:rFonts w:ascii="Times New Roman,Bold" w:hAnsi="Times New Roman,Bold" w:eastAsia="Times New Roman,Bold"/>
+          <w:b/>
+          <w:i w:val="0"/>
+          <w:color w:val="000000"/>
+          <w:sz w:val="20"/>
         </w:rPr>
-        <w:t>Cell: +91-9662201971 | +91 – 9606151900 sajoshaikh@gmail.com</w:t>
+        <w:t>end-to-end Point of Contact (POC)</w:t>
+      </w:r>
+      <w:r>
+        <w:rPr>
+          <w:rFonts w:ascii="Times New Roman" w:hAnsi="Times New Roman" w:eastAsia="Times New Roman"/>
+          <w:b w:val="0"/>
+          <w:i w:val="0"/>
+          <w:color w:val="000000"/>
+          <w:sz w:val="20"/>
+        </w:rPr>
+        <w:t xml:space="preserve"> for itinerary planning, travel consultation, and </w:t>
+      </w:r>
+      <w:r>
+        <w:tab/>
+      </w:r>
+      <w:r>
+        <w:rPr>
+          <w:rFonts w:ascii="Times New Roman" w:hAnsi="Times New Roman" w:eastAsia="Times New Roman"/>
+          <w:b w:val="0"/>
+          <w:i w:val="0"/>
+          <w:color w:val="000000"/>
+          <w:sz w:val="20"/>
+        </w:rPr>
+        <w:t xml:space="preserve">customer coordination. </w:t>
       </w:r>
     </w:p>
     <w:p>
       <w:pPr>
+        <w:autoSpaceDN w:val="0"/>
+        <w:tabs>
+          <w:tab w:pos="732" w:val="left"/>
+        </w:tabs>
+        <w:autoSpaceDE w:val="0"/>
+        <w:widowControl/>
+        <w:spacing w:line="258" w:lineRule="exact" w:before="10" w:after="0"/>
+        <w:ind w:left="372" w:right="720" w:firstLine="0"/>
         <w:jc w:val="left"/>
       </w:pPr>
       <w:r>
         <w:rPr>
-          <w:b/>
-          <w:sz w:val="28"/>
+          <w:rFonts w:ascii="Arial" w:hAnsi="Arial" w:eastAsia="Arial"/>
+          <w:b w:val="0"/>
+          <w:i w:val="0"/>
+          <w:color w:val="000000"/>
+          <w:sz w:val="20"/>
         </w:rPr>
-        <w:t>Professional Summary</w:t>
+        <w:t xml:space="preserve">• </w:t>
       </w:r>
-    </w:p>
-    <w:p>
+      <w:r>
+        <w:tab/>
+      </w:r>
       <w:r>
         <w:rPr>
-          <w:sz w:val="24"/>
+          <w:rFonts w:ascii="Times New Roman" w:hAnsi="Times New Roman" w:eastAsia="Times New Roman"/>
+          <w:b w:val="0"/>
+          <w:i w:val="0"/>
+          <w:color w:val="000000"/>
+          <w:sz w:val="20"/>
         </w:rPr>
-        <w:t>Travel consultant experienced in the design and supervision of travel arrangements for business users,</w:t>
+        <w:t xml:space="preserve">Creating detailed and customized </w:t>
       </w:r>
-    </w:p>
-    <w:p>
       <w:r>
         <w:rPr>
-          <w:sz w:val="24"/>
+          <w:rFonts w:ascii="Times New Roman,Bold" w:hAnsi="Times New Roman,Bold" w:eastAsia="Times New Roman,Bold"/>
+          <w:b/>
+          <w:i w:val="0"/>
+          <w:color w:val="000000"/>
+          <w:sz w:val="20"/>
         </w:rPr>
-        <w:t>Individuals, and couples. Ready to use network of resources to find clients the best and most affordable</w:t>
+        <w:t>domestic &amp; international itineraries</w:t>
       </w:r>
-    </w:p>
-    <w:p>
       <w:r>
         <w:rPr>
-          <w:sz w:val="24"/>
+          <w:rFonts w:ascii="Times New Roman" w:hAnsi="Times New Roman" w:eastAsia="Times New Roman"/>
+          <w:b w:val="0"/>
+          <w:i w:val="0"/>
+          <w:color w:val="000000"/>
+          <w:sz w:val="20"/>
         </w:rPr>
-        <w:t>accommodations in lodgings flights meals and business spaces.</w:t>
+        <w:t xml:space="preserve">, ensuring accuracy, cost </w:t>
+      </w:r>
+      <w:r>
+        <w:tab/>
+      </w:r>
+      <w:r>
+        <w:rPr>
+          <w:rFonts w:ascii="Times New Roman" w:hAnsi="Times New Roman" w:eastAsia="Times New Roman"/>
+          <w:b w:val="0"/>
+          <w:i w:val="0"/>
+          <w:color w:val="000000"/>
+          <w:sz w:val="20"/>
+        </w:rPr>
+        <w:t xml:space="preserve">efficiency, and customer satisfaction. </w:t>
       </w:r>
     </w:p>
     <w:p>
       <w:pPr>
+        <w:autoSpaceDN w:val="0"/>
+        <w:tabs>
+          <w:tab w:pos="732" w:val="left"/>
+        </w:tabs>
+        <w:autoSpaceDE w:val="0"/>
+        <w:widowControl/>
+        <w:spacing w:line="258" w:lineRule="exact" w:before="10" w:after="0"/>
+        <w:ind w:left="372" w:right="0" w:firstLine="0"/>
         <w:jc w:val="left"/>
       </w:pPr>
       <w:r>
         <w:rPr>
-          <w:b/>
-          <w:sz w:val="28"/>
+          <w:rFonts w:ascii="Arial" w:hAnsi="Arial" w:eastAsia="Arial"/>
+          <w:b w:val="0"/>
+          <w:i w:val="0"/>
+          <w:color w:val="000000"/>
+          <w:sz w:val="20"/>
         </w:rPr>
-        <w:t>Core Qualifications</w:t>
+        <w:t xml:space="preserve">• </w:t>
       </w:r>
-    </w:p>
-    <w:p>
+      <w:r>
+        <w:tab/>
+      </w:r>
       <w:r>
         <w:rPr>
-          <w:sz w:val="24"/>
+          <w:rFonts w:ascii="Times New Roman" w:hAnsi="Times New Roman" w:eastAsia="Times New Roman"/>
+          <w:b w:val="0"/>
+          <w:i w:val="0"/>
+          <w:color w:val="000000"/>
+          <w:sz w:val="20"/>
         </w:rPr>
-        <w:t>•</w:t>
+        <w:t xml:space="preserve">Handling </w:t>
       </w:r>
-    </w:p>
-    <w:p>
       <w:r>
         <w:rPr>
-          <w:sz w:val="24"/>
+          <w:rFonts w:ascii="Times New Roman,Bold" w:hAnsi="Times New Roman,Bold" w:eastAsia="Times New Roman,Bold"/>
+          <w:b/>
+          <w:i w:val="0"/>
+          <w:color w:val="000000"/>
+          <w:sz w:val="20"/>
         </w:rPr>
-        <w:t>Extensive background in travel practices with a leaning toward corporate needs</w:t>
+        <w:t>flight bookings, hotel reservations, holiday packages, and activity planning</w:t>
       </w:r>
-    </w:p>
-    <w:p>
       <w:r>
         <w:rPr>
-          <w:sz w:val="24"/>
+          <w:rFonts w:ascii="Times New Roman" w:hAnsi="Times New Roman" w:eastAsia="Times New Roman"/>
+          <w:b w:val="0"/>
+          <w:i w:val="0"/>
+          <w:color w:val="000000"/>
+          <w:sz w:val="20"/>
         </w:rPr>
-        <w:t>•</w:t>
+        <w:t xml:space="preserve"> across multiple </w:t>
       </w:r>
-    </w:p>
-    <w:p>
+      <w:r>
+        <w:tab/>
+      </w:r>
       <w:r>
         <w:rPr>
-          <w:sz w:val="24"/>
+          <w:rFonts w:ascii="Times New Roman" w:hAnsi="Times New Roman" w:eastAsia="Times New Roman"/>
+          <w:b w:val="0"/>
+          <w:i w:val="0"/>
+          <w:color w:val="000000"/>
+          <w:sz w:val="20"/>
         </w:rPr>
-        <w:t>Strong network of resources ready to provide specific business trip requirements</w:t>
-      </w:r>
-    </w:p>
-    <w:p>
-      <w:r>
-        <w:rPr>
-          <w:sz w:val="24"/>
-        </w:rPr>
-        <w:t>•</w:t>
-      </w:r>
-    </w:p>
-    <w:p>
-      <w:r>
-        <w:rPr>
-          <w:sz w:val="24"/>
-        </w:rPr>
-        <w:t>Can arrange travel by air, rail, road, boat etc.</w:t>
-      </w:r>
-    </w:p>
-    <w:p>
-      <w:r>
-        <w:rPr>
-          <w:sz w:val="24"/>
-        </w:rPr>
-        <w:t>•</w:t>
-      </w:r>
-    </w:p>
-    <w:p>
-      <w:r>
-        <w:rPr>
-          <w:sz w:val="24"/>
-        </w:rPr>
-        <w:t>Understanding of practices associated with reading defining and application of taxes hub utilization and</w:t>
-      </w:r>
-    </w:p>
-    <w:p>
-      <w:r>
-        <w:rPr>
-          <w:sz w:val="24"/>
-        </w:rPr>
-        <w:t>fare rules</w:t>
-      </w:r>
-    </w:p>
-    <w:p>
-      <w:r>
-        <w:rPr>
-          <w:sz w:val="24"/>
-        </w:rPr>
-        <w:t>•</w:t>
-      </w:r>
-    </w:p>
-    <w:p>
-      <w:r>
-        <w:rPr>
-          <w:sz w:val="24"/>
-        </w:rPr>
-        <w:t>Capable of providing the best accommodations while staying within a projected budget</w:t>
-      </w:r>
-    </w:p>
-    <w:p>
-      <w:r>
-        <w:rPr>
-          <w:sz w:val="24"/>
-        </w:rPr>
-        <w:t>•</w:t>
-      </w:r>
-    </w:p>
-    <w:p>
-      <w:r>
-        <w:rPr>
-          <w:sz w:val="24"/>
-        </w:rPr>
-        <w:t>Excellent oral and written communication skills ensuring all parties are appropriately informed</w:t>
+        <w:t xml:space="preserve">destinations. </w:t>
       </w:r>
     </w:p>
     <w:p>
       <w:pPr>
+        <w:autoSpaceDN w:val="0"/>
+        <w:tabs>
+          <w:tab w:pos="732" w:val="left"/>
+        </w:tabs>
+        <w:autoSpaceDE w:val="0"/>
+        <w:widowControl/>
+        <w:spacing w:line="258" w:lineRule="exact" w:before="10" w:after="0"/>
+        <w:ind w:left="372" w:right="0" w:firstLine="0"/>
         <w:jc w:val="left"/>
       </w:pPr>
       <w:r>
         <w:rPr>
+          <w:rFonts w:ascii="Arial" w:hAnsi="Arial" w:eastAsia="Arial"/>
+          <w:b w:val="0"/>
+          <w:i w:val="0"/>
+          <w:color w:val="000000"/>
+          <w:sz w:val="20"/>
+        </w:rPr>
+        <w:t xml:space="preserve">• </w:t>
+      </w:r>
+      <w:r>
+        <w:tab/>
+      </w:r>
+      <w:r>
+        <w:rPr>
+          <w:rFonts w:ascii="Times New Roman" w:hAnsi="Times New Roman" w:eastAsia="Times New Roman"/>
+          <w:b w:val="0"/>
+          <w:i w:val="0"/>
+          <w:color w:val="000000"/>
+          <w:sz w:val="20"/>
+        </w:rPr>
+        <w:t xml:space="preserve">Coordinating with </w:t>
+      </w:r>
+      <w:r>
+        <w:rPr>
+          <w:rFonts w:ascii="Times New Roman,Bold" w:hAnsi="Times New Roman,Bold" w:eastAsia="Times New Roman,Bold"/>
           <w:b/>
-          <w:sz w:val="28"/>
+          <w:i w:val="0"/>
+          <w:color w:val="000000"/>
+          <w:sz w:val="20"/>
         </w:rPr>
-        <w:t>Experience</w:t>
+        <w:t>hotels, airlines, vendors, and activity partners</w:t>
+      </w:r>
+      <w:r>
+        <w:rPr>
+          <w:rFonts w:ascii="Times New Roman" w:hAnsi="Times New Roman" w:eastAsia="Times New Roman"/>
+          <w:b w:val="0"/>
+          <w:i w:val="0"/>
+          <w:color w:val="000000"/>
+          <w:sz w:val="20"/>
+        </w:rPr>
+        <w:t xml:space="preserve"> to block inventory and secure the best </w:t>
+      </w:r>
+      <w:r>
+        <w:tab/>
+      </w:r>
+      <w:r>
+        <w:rPr>
+          <w:rFonts w:ascii="Times New Roman" w:hAnsi="Times New Roman" w:eastAsia="Times New Roman"/>
+          <w:b w:val="0"/>
+          <w:i w:val="0"/>
+          <w:color w:val="000000"/>
+          <w:sz w:val="20"/>
+        </w:rPr>
+        <w:t xml:space="preserve">options for clients. </w:t>
       </w:r>
     </w:p>
     <w:p>
       <w:pPr>
+        <w:autoSpaceDN w:val="0"/>
+        <w:tabs>
+          <w:tab w:pos="732" w:val="left"/>
+        </w:tabs>
+        <w:autoSpaceDE w:val="0"/>
+        <w:widowControl/>
+        <w:spacing w:line="258" w:lineRule="exact" w:before="10" w:after="0"/>
+        <w:ind w:left="372" w:right="144" w:firstLine="0"/>
         <w:jc w:val="left"/>
       </w:pPr>
       <w:r>
         <w:rPr>
+          <w:rFonts w:ascii="Arial" w:hAnsi="Arial" w:eastAsia="Arial"/>
+          <w:b w:val="0"/>
+          <w:i w:val="0"/>
+          <w:color w:val="000000"/>
+          <w:sz w:val="20"/>
+        </w:rPr>
+        <w:t xml:space="preserve">• </w:t>
+      </w:r>
+      <w:r>
+        <w:tab/>
+      </w:r>
+      <w:r>
+        <w:rPr>
+          <w:rFonts w:ascii="Times New Roman" w:hAnsi="Times New Roman" w:eastAsia="Times New Roman"/>
+          <w:b w:val="0"/>
+          <w:i w:val="0"/>
+          <w:color w:val="000000"/>
+          <w:sz w:val="20"/>
+        </w:rPr>
+        <w:t xml:space="preserve">Leading and supervising a team of </w:t>
+      </w:r>
+      <w:r>
+        <w:rPr>
+          <w:rFonts w:ascii="Times New Roman,Bold" w:hAnsi="Times New Roman,Bold" w:eastAsia="Times New Roman,Bold"/>
           <w:b/>
-          <w:sz w:val="28"/>
+          <w:i w:val="0"/>
+          <w:color w:val="000000"/>
+          <w:sz w:val="20"/>
         </w:rPr>
-        <w:t>Operations Manager</w:t>
+        <w:t>4 travel consultants</w:t>
+      </w:r>
+      <w:r>
+        <w:rPr>
+          <w:rFonts w:ascii="Times New Roman" w:hAnsi="Times New Roman" w:eastAsia="Times New Roman"/>
+          <w:b w:val="0"/>
+          <w:i w:val="0"/>
+          <w:color w:val="000000"/>
+          <w:sz w:val="20"/>
+        </w:rPr>
+        <w:t xml:space="preserve">, ensuring smooth workflow distribution, quality </w:t>
+      </w:r>
+      <w:r>
+        <w:tab/>
+      </w:r>
+      <w:r>
+        <w:rPr>
+          <w:rFonts w:ascii="Times New Roman" w:hAnsi="Times New Roman" w:eastAsia="Times New Roman"/>
+          <w:b w:val="0"/>
+          <w:i w:val="0"/>
+          <w:color w:val="000000"/>
+          <w:sz w:val="20"/>
+        </w:rPr>
+        <w:t xml:space="preserve">checks, and timely delivery. </w:t>
       </w:r>
     </w:p>
     <w:p>
       <w:pPr>
+        <w:autoSpaceDN w:val="0"/>
+        <w:tabs>
+          <w:tab w:pos="732" w:val="left"/>
+        </w:tabs>
+        <w:autoSpaceDE w:val="0"/>
+        <w:widowControl/>
+        <w:spacing w:line="262" w:lineRule="exact" w:before="4" w:after="0"/>
+        <w:ind w:left="372" w:right="288" w:firstLine="0"/>
+        <w:jc w:val="left"/>
+      </w:pPr>
+      <w:r>
+        <w:tab/>
+      </w:r>
+      <w:r>
+        <w:rPr>
+          <w:rFonts w:ascii="Times New Roman" w:hAnsi="Times New Roman" w:eastAsia="Times New Roman"/>
+          <w:b w:val="0"/>
+          <w:i w:val="0"/>
+          <w:color w:val="000000"/>
+          <w:sz w:val="20"/>
+        </w:rPr>
+        <w:t xml:space="preserve">Using </w:t>
+      </w:r>
+      <w:r>
+        <w:rPr>
+          <w:rFonts w:ascii="Times New Roman,Bold" w:hAnsi="Times New Roman,Bold" w:eastAsia="Times New Roman,Bold"/>
+          <w:b/>
+          <w:i w:val="0"/>
+          <w:color w:val="000000"/>
+          <w:sz w:val="20"/>
+        </w:rPr>
+        <w:t>Amadeus</w:t>
+      </w:r>
+      <w:r>
+        <w:rPr>
+          <w:rFonts w:ascii="Times New Roman" w:hAnsi="Times New Roman" w:eastAsia="Times New Roman"/>
+          <w:b w:val="0"/>
+          <w:i w:val="0"/>
+          <w:color w:val="000000"/>
+          <w:sz w:val="20"/>
+        </w:rPr>
+        <w:t xml:space="preserve"> for fare search, ticket issuance, PNR management, reissuance, and cancellations. </w:t>
+      </w:r>
+      <w:r>
+        <w:rPr>
+          <w:rFonts w:ascii="Arial" w:hAnsi="Arial" w:eastAsia="Arial"/>
+          <w:b w:val="0"/>
+          <w:i w:val="0"/>
+          <w:color w:val="000000"/>
+          <w:sz w:val="20"/>
+        </w:rPr>
+        <w:t xml:space="preserve">• </w:t>
+      </w:r>
+      <w:r>
+        <w:br/>
+      </w:r>
+      <w:r>
+        <w:rPr>
+          <w:rFonts w:ascii="Arial" w:hAnsi="Arial" w:eastAsia="Arial"/>
+          <w:b w:val="0"/>
+          <w:i w:val="0"/>
+          <w:color w:val="000000"/>
+          <w:sz w:val="20"/>
+        </w:rPr>
+        <w:t xml:space="preserve">• </w:t>
+      </w:r>
+      <w:r>
+        <w:tab/>
+      </w:r>
+      <w:r>
+        <w:rPr>
+          <w:rFonts w:ascii="Times New Roman" w:hAnsi="Times New Roman" w:eastAsia="Times New Roman"/>
+          <w:b w:val="0"/>
+          <w:i w:val="0"/>
+          <w:color w:val="000000"/>
+          <w:sz w:val="20"/>
+        </w:rPr>
+        <w:t xml:space="preserve">Managing </w:t>
+      </w:r>
+      <w:r>
+        <w:rPr>
+          <w:rFonts w:ascii="Times New Roman,Bold" w:hAnsi="Times New Roman,Bold" w:eastAsia="Times New Roman,Bold"/>
+          <w:b/>
+          <w:i w:val="0"/>
+          <w:color w:val="000000"/>
+          <w:sz w:val="20"/>
+        </w:rPr>
+        <w:t>special service requests (SSRs)</w:t>
+      </w:r>
+      <w:r>
+        <w:rPr>
+          <w:rFonts w:ascii="Times New Roman" w:hAnsi="Times New Roman" w:eastAsia="Times New Roman"/>
+          <w:b w:val="0"/>
+          <w:i w:val="0"/>
+          <w:color w:val="000000"/>
+          <w:sz w:val="20"/>
+        </w:rPr>
+        <w:t xml:space="preserve"> such as meal preferences, wheelchair assistance, and seat </w:t>
+      </w:r>
+      <w:r>
+        <w:tab/>
+      </w:r>
+      <w:r>
+        <w:rPr>
+          <w:rFonts w:ascii="Times New Roman" w:hAnsi="Times New Roman" w:eastAsia="Times New Roman"/>
+          <w:b w:val="0"/>
+          <w:i w:val="0"/>
+          <w:color w:val="000000"/>
+          <w:sz w:val="20"/>
+        </w:rPr>
+        <w:t xml:space="preserve">selection. </w:t>
+      </w:r>
+    </w:p>
+    <w:p>
+      <w:pPr>
+        <w:autoSpaceDN w:val="0"/>
+        <w:tabs>
+          <w:tab w:pos="732" w:val="left"/>
+        </w:tabs>
+        <w:autoSpaceDE w:val="0"/>
+        <w:widowControl/>
+        <w:spacing w:line="222" w:lineRule="exact" w:before="46" w:after="0"/>
+        <w:ind w:left="372" w:right="0" w:firstLine="0"/>
         <w:jc w:val="left"/>
       </w:pPr>
       <w:r>
         <w:rPr>
+          <w:rFonts w:ascii="Arial" w:hAnsi="Arial" w:eastAsia="Arial"/>
+          <w:b w:val="0"/>
+          <w:i w:val="0"/>
+          <w:color w:val="000000"/>
+          <w:sz w:val="20"/>
+        </w:rPr>
+        <w:t xml:space="preserve">• </w:t>
+      </w:r>
+      <w:r>
+        <w:tab/>
+      </w:r>
+      <w:r>
+        <w:rPr>
+          <w:rFonts w:ascii="Times New Roman" w:hAnsi="Times New Roman" w:eastAsia="Times New Roman"/>
+          <w:b w:val="0"/>
+          <w:i w:val="0"/>
+          <w:color w:val="000000"/>
+          <w:sz w:val="20"/>
+        </w:rPr>
+        <w:t xml:space="preserve">Ensuring </w:t>
+      </w:r>
+      <w:r>
+        <w:rPr>
+          <w:rFonts w:ascii="Times New Roman,Bold" w:hAnsi="Times New Roman,Bold" w:eastAsia="Times New Roman,Bold"/>
           <w:b/>
-          <w:sz w:val="28"/>
+          <w:i w:val="0"/>
+          <w:color w:val="000000"/>
+          <w:sz w:val="20"/>
         </w:rPr>
-        <w:t>21 st Oct 2024 – Present</w:t>
+        <w:t>compliance with company policies</w:t>
+      </w:r>
+      <w:r>
+        <w:rPr>
+          <w:rFonts w:ascii="Times New Roman" w:hAnsi="Times New Roman" w:eastAsia="Times New Roman"/>
+          <w:b w:val="0"/>
+          <w:i w:val="0"/>
+          <w:color w:val="000000"/>
+          <w:sz w:val="20"/>
+        </w:rPr>
+        <w:t xml:space="preserve">, travel guidelines, and vendor SLAs. </w:t>
       </w:r>
     </w:p>
     <w:p>
       <w:pPr>
+        <w:autoSpaceDN w:val="0"/>
+        <w:tabs>
+          <w:tab w:pos="732" w:val="left"/>
+        </w:tabs>
+        <w:autoSpaceDE w:val="0"/>
+        <w:widowControl/>
+        <w:spacing w:line="224" w:lineRule="exact" w:before="44" w:after="0"/>
+        <w:ind w:left="372" w:right="0" w:firstLine="0"/>
         <w:jc w:val="left"/>
       </w:pPr>
       <w:r>
         <w:rPr>
-          <w:b/>
-          <w:sz w:val="28"/>
+          <w:rFonts w:ascii="Arial" w:hAnsi="Arial" w:eastAsia="Arial"/>
+          <w:b w:val="0"/>
+          <w:i w:val="0"/>
+          <w:color w:val="000000"/>
+          <w:sz w:val="20"/>
         </w:rPr>
-        <w:t>Traventions Pvt Ltd</w:t>
+        <w:t xml:space="preserve">• </w:t>
       </w:r>
-    </w:p>
-    <w:p>
+      <w:r>
+        <w:tab/>
+      </w:r>
       <w:r>
         <w:rPr>
-          <w:sz w:val="24"/>
+          <w:rFonts w:ascii="Times New Roman" w:hAnsi="Times New Roman" w:eastAsia="Times New Roman"/>
+          <w:b w:val="0"/>
+          <w:i w:val="0"/>
+          <w:color w:val="000000"/>
+          <w:sz w:val="20"/>
         </w:rPr>
-        <w:t>•</w:t>
+        <w:t xml:space="preserve">Handling </w:t>
+      </w:r>
+      <w:r>
+        <w:rPr>
+          <w:rFonts w:ascii="Times New Roman,Bold" w:hAnsi="Times New Roman,Bold" w:eastAsia="Times New Roman,Bold"/>
+          <w:b/>
+          <w:i w:val="0"/>
+          <w:color w:val="000000"/>
+          <w:sz w:val="20"/>
+        </w:rPr>
+        <w:t>customer escalations</w:t>
+      </w:r>
+      <w:r>
+        <w:rPr>
+          <w:rFonts w:ascii="Times New Roman" w:hAnsi="Times New Roman" w:eastAsia="Times New Roman"/>
+          <w:b w:val="0"/>
+          <w:i w:val="0"/>
+          <w:color w:val="000000"/>
+          <w:sz w:val="20"/>
+        </w:rPr>
+        <w:t xml:space="preserve">, providing quick resolutions, and maintaining high service satisfaction. </w:t>
       </w:r>
     </w:p>
     <w:p>
       <w:pPr>
+        <w:autoSpaceDN w:val="0"/>
+        <w:tabs>
+          <w:tab w:pos="732" w:val="left"/>
+        </w:tabs>
+        <w:autoSpaceDE w:val="0"/>
+        <w:widowControl/>
+        <w:spacing w:line="258" w:lineRule="exact" w:before="6" w:after="0"/>
+        <w:ind w:left="372" w:right="288" w:firstLine="0"/>
         <w:jc w:val="left"/>
       </w:pPr>
       <w:r>
         <w:rPr>
-          <w:b/>
-          <w:sz w:val="28"/>
+          <w:rFonts w:ascii="Arial" w:hAnsi="Arial" w:eastAsia="Arial"/>
+          <w:b w:val="0"/>
+          <w:i w:val="0"/>
+          <w:color w:val="000000"/>
+          <w:sz w:val="20"/>
         </w:rPr>
-        <w:t>Serving as the end-to-end Point of Contact (POC) for itinerary planning, travel consultation, and</w:t>
+        <w:t xml:space="preserve">• </w:t>
       </w:r>
-    </w:p>
-    <w:p>
+      <w:r>
+        <w:tab/>
+      </w:r>
       <w:r>
         <w:rPr>
-          <w:sz w:val="24"/>
+          <w:rFonts w:ascii="Times New Roman" w:hAnsi="Times New Roman" w:eastAsia="Times New Roman"/>
+          <w:b w:val="0"/>
+          <w:i w:val="0"/>
+          <w:color w:val="000000"/>
+          <w:sz w:val="20"/>
         </w:rPr>
-        <w:t>customer coordination.</w:t>
+        <w:t xml:space="preserve">Monitoring </w:t>
       </w:r>
-    </w:p>
-    <w:p>
       <w:r>
         <w:rPr>
-          <w:sz w:val="24"/>
+          <w:rFonts w:ascii="Times New Roman,Bold" w:hAnsi="Times New Roman,Bold" w:eastAsia="Times New Roman,Bold"/>
+          <w:b/>
+          <w:i w:val="0"/>
+          <w:color w:val="000000"/>
+          <w:sz w:val="20"/>
         </w:rPr>
-        <w:t>•</w:t>
+        <w:t>daily operations</w:t>
+      </w:r>
+      <w:r>
+        <w:rPr>
+          <w:rFonts w:ascii="Times New Roman" w:hAnsi="Times New Roman" w:eastAsia="Times New Roman"/>
+          <w:b w:val="0"/>
+          <w:i w:val="0"/>
+          <w:color w:val="000000"/>
+          <w:sz w:val="20"/>
+        </w:rPr>
+        <w:t xml:space="preserve">, generating reports, and optimizing processes to improve efficiency and </w:t>
+      </w:r>
+      <w:r>
+        <w:tab/>
+      </w:r>
+      <w:r>
+        <w:rPr>
+          <w:rFonts w:ascii="Times New Roman" w:hAnsi="Times New Roman" w:eastAsia="Times New Roman"/>
+          <w:b w:val="0"/>
+          <w:i w:val="0"/>
+          <w:color w:val="000000"/>
+          <w:sz w:val="20"/>
+        </w:rPr>
+        <w:t xml:space="preserve">reduce errors. </w:t>
       </w:r>
     </w:p>
     <w:p>
       <w:pPr>
+        <w:autoSpaceDN w:val="0"/>
+        <w:tabs>
+          <w:tab w:pos="732" w:val="left"/>
+        </w:tabs>
+        <w:autoSpaceDE w:val="0"/>
+        <w:widowControl/>
+        <w:spacing w:line="258" w:lineRule="exact" w:before="10" w:after="0"/>
+        <w:ind w:left="372" w:right="432" w:firstLine="0"/>
         <w:jc w:val="left"/>
       </w:pPr>
       <w:r>
         <w:rPr>
-          <w:b/>
-          <w:sz w:val="28"/>
+          <w:rFonts w:ascii="Arial" w:hAnsi="Arial" w:eastAsia="Arial"/>
+          <w:b w:val="0"/>
+          <w:i w:val="0"/>
+          <w:color w:val="000000"/>
+          <w:sz w:val="20"/>
         </w:rPr>
-        <w:t>Creating detailed and customized domestic &amp; international itineraries , ensuring accuracy, cost</w:t>
+        <w:t xml:space="preserve">• </w:t>
       </w:r>
-    </w:p>
-    <w:p>
+      <w:r>
+        <w:tab/>
+      </w:r>
       <w:r>
         <w:rPr>
-          <w:sz w:val="24"/>
+          <w:rFonts w:ascii="Times New Roman" w:hAnsi="Times New Roman" w:eastAsia="Times New Roman"/>
+          <w:b w:val="0"/>
+          <w:i w:val="0"/>
+          <w:color w:val="000000"/>
+          <w:sz w:val="20"/>
         </w:rPr>
-        <w:t>efficiency, and customer satisfaction.</w:t>
+        <w:t xml:space="preserve">Coordinating with the internal </w:t>
       </w:r>
-    </w:p>
-    <w:p>
       <w:r>
         <w:rPr>
-          <w:sz w:val="24"/>
+          <w:rFonts w:ascii="Times New Roman,Bold" w:hAnsi="Times New Roman,Bold" w:eastAsia="Times New Roman,Bold"/>
+          <w:b/>
+          <w:i w:val="0"/>
+          <w:color w:val="000000"/>
+          <w:sz w:val="20"/>
         </w:rPr>
-        <w:t>•</w:t>
+        <w:t>flight operations team</w:t>
       </w:r>
-    </w:p>
-    <w:p>
       <w:r>
         <w:rPr>
-          <w:b/>
-          <w:sz w:val="24"/>
+          <w:rFonts w:ascii="Times New Roman" w:hAnsi="Times New Roman" w:eastAsia="Times New Roman"/>
+          <w:b w:val="0"/>
+          <w:i w:val="0"/>
+          <w:color w:val="000000"/>
+          <w:sz w:val="20"/>
         </w:rPr>
-        <w:t>Handling flight bookings, hotel reservations, holiday packages, and activity planning across multiple</w:t>
+        <w:t xml:space="preserve"> for ticket blocks, fare confirmations, and last-</w:t>
       </w:r>
-    </w:p>
-    <w:p>
+      <w:r>
+        <w:tab/>
+      </w:r>
       <w:r>
         <w:rPr>
-          <w:sz w:val="24"/>
+          <w:rFonts w:ascii="Times New Roman" w:hAnsi="Times New Roman" w:eastAsia="Times New Roman"/>
+          <w:b w:val="0"/>
+          <w:i w:val="0"/>
+          <w:color w:val="000000"/>
+          <w:sz w:val="20"/>
         </w:rPr>
-        <w:t>destinations.</w:t>
-      </w:r>
-    </w:p>
-    <w:p>
-      <w:r>
-        <w:rPr>
-          <w:sz w:val="24"/>
-        </w:rPr>
-        <w:t>•</w:t>
-      </w:r>
-    </w:p>
-    <w:p>
-      <w:r>
-        <w:rPr>
-          <w:b/>
-          <w:sz w:val="24"/>
-        </w:rPr>
-        <w:t>Coordinating with hotels, airlines, vendors, and activity partners to block inventory and secure the best</w:t>
-      </w:r>
-    </w:p>
-    <w:p>
-      <w:r>
-        <w:rPr>
-          <w:sz w:val="24"/>
-        </w:rPr>
-        <w:t>options for clients.</w:t>
-      </w:r>
-    </w:p>
-    <w:p>
-      <w:r>
-        <w:rPr>
-          <w:sz w:val="24"/>
-        </w:rPr>
-        <w:t>•</w:t>
-      </w:r>
-    </w:p>
-    <w:p>
-      <w:r>
-        <w:rPr>
-          <w:b/>
-          <w:sz w:val="24"/>
-        </w:rPr>
-        <w:t>Leading and supervising a team of 4 travel consultants , ensuring smooth workflow distribution, quality</w:t>
-      </w:r>
-    </w:p>
-    <w:p>
-      <w:r>
-        <w:rPr>
-          <w:sz w:val="24"/>
-        </w:rPr>
-        <w:t>checks, and timely delivery.</w:t>
-      </w:r>
-    </w:p>
-    <w:p>
-      <w:r>
-        <w:rPr>
-          <w:sz w:val="24"/>
-        </w:rPr>
-        <w:t>•</w:t>
+        <w:t xml:space="preserve">minute changes. </w:t>
       </w:r>
     </w:p>
     <w:p>
       <w:pPr>
+        <w:autoSpaceDN w:val="0"/>
+        <w:tabs>
+          <w:tab w:pos="732" w:val="left"/>
+        </w:tabs>
+        <w:autoSpaceDE w:val="0"/>
+        <w:widowControl/>
+        <w:spacing w:line="270" w:lineRule="exact" w:before="0" w:after="0"/>
+        <w:ind w:left="372" w:right="0" w:firstLine="0"/>
         <w:jc w:val="left"/>
       </w:pPr>
       <w:r>
         <w:rPr>
-          <w:b/>
-          <w:sz w:val="28"/>
+          <w:rFonts w:ascii="Arial" w:hAnsi="Arial" w:eastAsia="Arial"/>
+          <w:b w:val="0"/>
+          <w:i w:val="0"/>
+          <w:color w:val="000000"/>
+          <w:sz w:val="20"/>
         </w:rPr>
-        <w:t>Using Amadeus for fare search, ticket issuance, PNR management, reissuance, and cancellations.</w:t>
+        <w:t xml:space="preserve">• </w:t>
       </w:r>
-    </w:p>
-    <w:p>
+      <w:r>
+        <w:tab/>
+      </w:r>
       <w:r>
         <w:rPr>
-          <w:sz w:val="24"/>
+          <w:rFonts w:ascii="Times New Roman" w:hAnsi="Times New Roman" w:eastAsia="Times New Roman"/>
+          <w:b w:val="0"/>
+          <w:i w:val="0"/>
+          <w:color w:val="000000"/>
+          <w:sz w:val="20"/>
         </w:rPr>
-        <w:t>•</w:t>
+        <w:t xml:space="preserve">Maintaining strong relationships with suppliers to negotiate </w:t>
+      </w:r>
+      <w:r>
+        <w:rPr>
+          <w:rFonts w:ascii="Times New Roman,Bold" w:hAnsi="Times New Roman,Bold" w:eastAsia="Times New Roman,Bold"/>
+          <w:b/>
+          <w:i w:val="0"/>
+          <w:color w:val="000000"/>
+          <w:sz w:val="20"/>
+        </w:rPr>
+        <w:t>best rates and value-added services</w:t>
+      </w:r>
+      <w:r>
+        <w:rPr>
+          <w:rFonts w:ascii="Times New Roman" w:hAnsi="Times New Roman" w:eastAsia="Times New Roman"/>
+          <w:b w:val="0"/>
+          <w:i w:val="0"/>
+          <w:color w:val="000000"/>
+          <w:sz w:val="20"/>
+        </w:rPr>
+        <w:t xml:space="preserve">. </w:t>
+      </w:r>
+      <w:r>
+        <w:rPr>
+          <w:rFonts w:ascii="Arial" w:hAnsi="Arial" w:eastAsia="Arial"/>
+          <w:b w:val="0"/>
+          <w:i w:val="0"/>
+          <w:color w:val="000000"/>
+          <w:sz w:val="20"/>
+        </w:rPr>
+        <w:t xml:space="preserve">• </w:t>
+      </w:r>
+      <w:r>
+        <w:tab/>
+      </w:r>
+      <w:r>
+        <w:rPr>
+          <w:rFonts w:ascii="Times New Roman" w:hAnsi="Times New Roman" w:eastAsia="Times New Roman"/>
+          <w:b w:val="0"/>
+          <w:i w:val="0"/>
+          <w:color w:val="000000"/>
+          <w:sz w:val="20"/>
+        </w:rPr>
+        <w:t xml:space="preserve">Updating clients about </w:t>
+      </w:r>
+      <w:r>
+        <w:rPr>
+          <w:rFonts w:ascii="Times New Roman,Bold" w:hAnsi="Times New Roman,Bold" w:eastAsia="Times New Roman,Bold"/>
+          <w:b/>
+          <w:i w:val="0"/>
+          <w:color w:val="000000"/>
+          <w:sz w:val="20"/>
+        </w:rPr>
+        <w:t>travel advisories, visa requirements, airline rules, and destination guidelines</w:t>
+      </w:r>
+      <w:r>
+        <w:rPr>
+          <w:rFonts w:ascii="Times New Roman" w:hAnsi="Times New Roman" w:eastAsia="Times New Roman"/>
+          <w:b w:val="0"/>
+          <w:i w:val="0"/>
+          <w:color w:val="000000"/>
+          <w:sz w:val="20"/>
+        </w:rPr>
+        <w:t xml:space="preserve">. </w:t>
       </w:r>
     </w:p>
     <w:p>
       <w:pPr>
+        <w:sectPr>
+          <w:type w:val="continuous"/>
+          <w:pgSz w:w="11906" w:h="16838"/>
+          <w:pgMar w:top="730" w:right="1332" w:bottom="1440" w:left="1280" w:header="720" w:footer="720" w:gutter="0"/>
+          <w:cols/>
+          <w:docGrid w:linePitch="360"/>
+        </w:sectPr>
+      </w:pPr>
+    </w:p>
+    <w:p>
+      <w:pPr>
+        <w:autoSpaceDN w:val="0"/>
+        <w:autoSpaceDE w:val="0"/>
+        <w:widowControl/>
+        <w:spacing w:line="220" w:lineRule="exact" w:before="0" w:after="510"/>
+        <w:ind w:left="0" w:right="0"/>
+      </w:pPr>
+      <w:r>
+        <w:drawing>
+          <wp:anchor xmlns:a="http://schemas.openxmlformats.org/drawingml/2006/main" xmlns:pic="http://schemas.openxmlformats.org/drawingml/2006/picture" distT="0" distB="0" distL="0" distR="0" simplePos="0" relativeHeight="0" behindDoc="1" locked="0" layoutInCell="1" allowOverlap="1">
+            <wp:simplePos x="0" y="0"/>
+            <wp:positionH relativeFrom="page">
+              <wp:posOffset>838200</wp:posOffset>
+            </wp:positionH>
+            <wp:positionV relativeFrom="page">
+              <wp:posOffset>5727700</wp:posOffset>
+            </wp:positionV>
+            <wp:extent cx="5715000" cy="114300"/>
+            <wp:wrapNone/>
+            <wp:docPr id="5" name="Picture 5"/>
+            <wp:cNvGraphicFramePr>
+              <a:graphicFrameLocks noChangeAspect="1"/>
+            </wp:cNvGraphicFramePr>
+            <a:graphic>
+              <a:graphicData uri="http://schemas.openxmlformats.org/drawingml/2006/picture">
+                <pic:pic>
+                  <pic:nvPicPr>
+                    <pic:cNvPr id="0" name="image.png"/>
+                    <pic:cNvPicPr/>
+                  </pic:nvPicPr>
+                  <pic:blipFill>
+                    <a:blip r:embed="rId13"/>
+                    <a:stretch>
+                      <a:fillRect/>
+                    </a:stretch>
+                  </pic:blipFill>
+                  <pic:spPr>
+                    <a:xfrm>
+                      <a:off x="0" y="0"/>
+                      <a:ext cx="5715000" cy="114300"/>
+                    </a:xfrm>
+                    <a:prstGeom prst="rect"/>
+                  </pic:spPr>
+                </pic:pic>
+              </a:graphicData>
+            </a:graphic>
+          </wp:anchor>
+        </w:drawing>
+      </w:r>
+      <w:r>
+        <w:drawing>
+          <wp:anchor xmlns:a="http://schemas.openxmlformats.org/drawingml/2006/main" xmlns:pic="http://schemas.openxmlformats.org/drawingml/2006/picture" distT="0" distB="0" distL="0" distR="0" simplePos="0" relativeHeight="0" behindDoc="1" locked="0" layoutInCell="1" allowOverlap="1">
+            <wp:simplePos x="0" y="0"/>
+            <wp:positionH relativeFrom="page">
+              <wp:posOffset>820419</wp:posOffset>
+            </wp:positionH>
+            <wp:positionV relativeFrom="page">
+              <wp:posOffset>5721350</wp:posOffset>
+            </wp:positionV>
+            <wp:extent cx="5769609" cy="146066"/>
+            <wp:wrapNone/>
+            <wp:docPr id="6" name="Picture 6"/>
+            <wp:cNvGraphicFramePr>
+              <a:graphicFrameLocks noChangeAspect="1"/>
+            </wp:cNvGraphicFramePr>
+            <a:graphic>
+              <a:graphicData uri="http://schemas.openxmlformats.org/drawingml/2006/picture">
+                <pic:pic>
+                  <pic:nvPicPr>
+                    <pic:cNvPr id="0" name="image.png"/>
+                    <pic:cNvPicPr/>
+                  </pic:nvPicPr>
+                  <pic:blipFill>
+                    <a:blip r:embed="rId12"/>
+                    <a:stretch>
+                      <a:fillRect/>
+                    </a:stretch>
+                  </pic:blipFill>
+                  <pic:spPr>
+                    <a:xfrm>
+                      <a:off x="0" y="0"/>
+                      <a:ext cx="5769609" cy="146066"/>
+                    </a:xfrm>
+                    <a:prstGeom prst="rect"/>
+                  </pic:spPr>
+                </pic:pic>
+              </a:graphicData>
+            </a:graphic>
+          </wp:anchor>
+        </w:drawing>
+      </w:r>
+      <w:r>
+        <w:drawing>
+          <wp:anchor xmlns:a="http://schemas.openxmlformats.org/drawingml/2006/main" xmlns:pic="http://schemas.openxmlformats.org/drawingml/2006/picture" distT="0" distB="0" distL="0" distR="0" simplePos="0" relativeHeight="0" behindDoc="1" locked="0" layoutInCell="1" allowOverlap="1">
+            <wp:simplePos x="0" y="0"/>
+            <wp:positionH relativeFrom="page">
+              <wp:posOffset>939800</wp:posOffset>
+            </wp:positionH>
+            <wp:positionV relativeFrom="page">
+              <wp:posOffset>6807200</wp:posOffset>
+            </wp:positionV>
+            <wp:extent cx="5715000" cy="114300"/>
+            <wp:wrapNone/>
+            <wp:docPr id="7" name="Picture 7"/>
+            <wp:cNvGraphicFramePr>
+              <a:graphicFrameLocks noChangeAspect="1"/>
+            </wp:cNvGraphicFramePr>
+            <a:graphic>
+              <a:graphicData uri="http://schemas.openxmlformats.org/drawingml/2006/picture">
+                <pic:pic>
+                  <pic:nvPicPr>
+                    <pic:cNvPr id="0" name="image.png"/>
+                    <pic:cNvPicPr/>
+                  </pic:nvPicPr>
+                  <pic:blipFill>
+                    <a:blip r:embed="rId14"/>
+                    <a:stretch>
+                      <a:fillRect/>
+                    </a:stretch>
+                  </pic:blipFill>
+                  <pic:spPr>
+                    <a:xfrm>
+                      <a:off x="0" y="0"/>
+                      <a:ext cx="5715000" cy="114300"/>
+                    </a:xfrm>
+                    <a:prstGeom prst="rect"/>
+                  </pic:spPr>
+                </pic:pic>
+              </a:graphicData>
+            </a:graphic>
+          </wp:anchor>
+        </w:drawing>
+      </w:r>
+      <w:r>
+        <w:drawing>
+          <wp:anchor xmlns:a="http://schemas.openxmlformats.org/drawingml/2006/main" xmlns:pic="http://schemas.openxmlformats.org/drawingml/2006/picture" distT="0" distB="0" distL="0" distR="0" simplePos="0" relativeHeight="0" behindDoc="1" locked="0" layoutInCell="1" allowOverlap="1">
+            <wp:simplePos x="0" y="0"/>
+            <wp:positionH relativeFrom="page">
+              <wp:posOffset>915669</wp:posOffset>
+            </wp:positionH>
+            <wp:positionV relativeFrom="page">
+              <wp:posOffset>6799580</wp:posOffset>
+            </wp:positionV>
+            <wp:extent cx="5768339" cy="146034"/>
+            <wp:wrapNone/>
+            <wp:docPr id="8" name="Picture 8"/>
+            <wp:cNvGraphicFramePr>
+              <a:graphicFrameLocks noChangeAspect="1"/>
+            </wp:cNvGraphicFramePr>
+            <a:graphic>
+              <a:graphicData uri="http://schemas.openxmlformats.org/drawingml/2006/picture">
+                <pic:pic>
+                  <pic:nvPicPr>
+                    <pic:cNvPr id="0" name="image.png"/>
+                    <pic:cNvPicPr/>
+                  </pic:nvPicPr>
+                  <pic:blipFill>
+                    <a:blip r:embed="rId12"/>
+                    <a:stretch>
+                      <a:fillRect/>
+                    </a:stretch>
+                  </pic:blipFill>
+                  <pic:spPr>
+                    <a:xfrm>
+                      <a:off x="0" y="0"/>
+                      <a:ext cx="5768339" cy="146034"/>
+                    </a:xfrm>
+                    <a:prstGeom prst="rect"/>
+                  </pic:spPr>
+                </pic:pic>
+              </a:graphicData>
+            </a:graphic>
+          </wp:anchor>
+        </w:drawing>
+      </w:r>
+    </w:p>
+    <w:p>
+      <w:pPr>
+        <w:autoSpaceDN w:val="0"/>
+        <w:tabs>
+          <w:tab w:pos="7032" w:val="left"/>
+        </w:tabs>
+        <w:autoSpaceDE w:val="0"/>
+        <w:widowControl/>
+        <w:spacing w:line="244" w:lineRule="exact" w:before="0" w:after="0"/>
+        <w:ind w:left="0" w:right="0" w:firstLine="0"/>
         <w:jc w:val="left"/>
       </w:pPr>
       <w:r>
         <w:rPr>
+          <w:rFonts w:ascii="Times New Roman,Bold" w:hAnsi="Times New Roman,Bold" w:eastAsia="Times New Roman,Bold"/>
           <w:b/>
-          <w:sz w:val="28"/>
+          <w:i w:val="0"/>
+          <w:color w:val="000000"/>
+          <w:sz w:val="22"/>
         </w:rPr>
-        <w:t>Managing special service requests (SSRs) such as meal preferences, wheelchair assistance, and seat</w:t>
+        <w:t xml:space="preserve">Sr. Manager - Travel Consultant </w:t>
       </w:r>
-    </w:p>
-    <w:p>
+      <w:r>
+        <w:tab/>
+      </w:r>
       <w:r>
         <w:rPr>
-          <w:sz w:val="24"/>
+          <w:rFonts w:ascii="Times New Roman,Bold" w:hAnsi="Times New Roman,Bold" w:eastAsia="Times New Roman,Bold"/>
+          <w:b/>
+          <w:i w:val="0"/>
+          <w:color w:val="000000"/>
+          <w:sz w:val="22"/>
         </w:rPr>
-        <w:t>selection.</w:t>
-      </w:r>
-    </w:p>
-    <w:p>
-      <w:r>
-        <w:rPr>
-          <w:sz w:val="24"/>
-        </w:rPr>
-        <w:t>•</w:t>
+        <w:t xml:space="preserve">May 2010 – Aug 2019 </w:t>
       </w:r>
     </w:p>
     <w:p>
       <w:pPr>
+        <w:autoSpaceDN w:val="0"/>
+        <w:autoSpaceDE w:val="0"/>
+        <w:widowControl/>
+        <w:spacing w:line="244" w:lineRule="exact" w:before="30" w:after="0"/>
+        <w:ind w:left="0" w:right="0" w:firstLine="0"/>
         <w:jc w:val="left"/>
       </w:pPr>
       <w:r>
         <w:rPr>
+          <w:rFonts w:ascii="Times New Roman,Bold" w:hAnsi="Times New Roman,Bold" w:eastAsia="Times New Roman,Bold"/>
           <w:b/>
-          <w:sz w:val="28"/>
+          <w:i w:val="0"/>
+          <w:color w:val="000000"/>
+          <w:sz w:val="22"/>
         </w:rPr>
-        <w:t>Ensuring compliance with company policies , travel guidelines, and vendor SLAs.</w:t>
-      </w:r>
-    </w:p>
-    <w:p>
-      <w:r>
-        <w:rPr>
-          <w:sz w:val="24"/>
-        </w:rPr>
-        <w:t>•</w:t>
-      </w:r>
-    </w:p>
-    <w:p>
-      <w:r>
-        <w:rPr>
-          <w:b/>
-          <w:sz w:val="24"/>
-        </w:rPr>
-        <w:t>Handling customer escalations , providing quick resolutions, and maintaining high service satisfaction.</w:t>
-      </w:r>
-    </w:p>
-    <w:p>
-      <w:r>
-        <w:rPr>
-          <w:sz w:val="24"/>
-        </w:rPr>
-        <w:t>•</w:t>
-      </w:r>
-    </w:p>
-    <w:p>
-      <w:r>
-        <w:rPr>
-          <w:b/>
-          <w:sz w:val="24"/>
-        </w:rPr>
-        <w:t>Monitoring daily operations , generating reports, and optimizing processes to improve efficiency and</w:t>
-      </w:r>
-    </w:p>
-    <w:p>
-      <w:r>
-        <w:rPr>
-          <w:sz w:val="24"/>
-        </w:rPr>
-        <w:t>reduce errors.</w:t>
-      </w:r>
-    </w:p>
-    <w:p>
-      <w:r>
-        <w:rPr>
-          <w:sz w:val="24"/>
-        </w:rPr>
-        <w:t>•</w:t>
-      </w:r>
-    </w:p>
-    <w:p>
-      <w:r>
-        <w:rPr>
-          <w:b/>
-          <w:sz w:val="24"/>
-        </w:rPr>
-        <w:t>Coordinating with the internal flight operations team for ticket blocks, fare confirmations, and last-</w:t>
-      </w:r>
-    </w:p>
-    <w:p>
-      <w:r>
-        <w:rPr>
-          <w:sz w:val="24"/>
-        </w:rPr>
-        <w:t>minute changes.</w:t>
-      </w:r>
-    </w:p>
-    <w:p>
-      <w:r>
-        <w:rPr>
-          <w:sz w:val="24"/>
-        </w:rPr>
-        <w:t>•</w:t>
+        <w:t xml:space="preserve">LEISURE TOURS &amp; TRAVELS, Ahmedabad </w:t>
       </w:r>
     </w:p>
     <w:p>
       <w:pPr>
+        <w:autoSpaceDN w:val="0"/>
+        <w:tabs>
+          <w:tab w:pos="720" w:val="left"/>
+        </w:tabs>
+        <w:autoSpaceDE w:val="0"/>
+        <w:widowControl/>
+        <w:spacing w:line="224" w:lineRule="exact" w:before="18" w:after="0"/>
+        <w:ind w:left="360" w:right="0" w:firstLine="0"/>
         <w:jc w:val="left"/>
       </w:pPr>
       <w:r>
         <w:rPr>
-          <w:b/>
-          <w:sz w:val="28"/>
+          <w:rFonts w:ascii="Arial" w:hAnsi="Arial" w:eastAsia="Arial"/>
+          <w:b w:val="0"/>
+          <w:i w:val="0"/>
+          <w:color w:val="000000"/>
+          <w:sz w:val="20"/>
         </w:rPr>
-        <w:t>Maintaining strong relationships with suppliers to negotiate best rates and value-added services .</w:t>
+        <w:t xml:space="preserve">• </w:t>
       </w:r>
-    </w:p>
-    <w:p>
+      <w:r>
+        <w:tab/>
+      </w:r>
       <w:r>
         <w:rPr>
-          <w:sz w:val="24"/>
+          <w:rFonts w:ascii="Times New Roman" w:hAnsi="Times New Roman" w:eastAsia="Times New Roman"/>
+          <w:b w:val="0"/>
+          <w:i w:val="0"/>
+          <w:color w:val="000000"/>
+          <w:sz w:val="20"/>
         </w:rPr>
-        <w:t>•</w:t>
-      </w:r>
-    </w:p>
-    <w:p>
-      <w:r>
-        <w:rPr>
-          <w:b/>
-          <w:sz w:val="24"/>
-        </w:rPr>
-        <w:t>Updating clients about travel advisories, visa requirements, airline rules, and destination guidelines .</w:t>
-      </w:r>
-    </w:p>
-    <w:p>
-      <w:r>
-        <w:br w:type="page"/>
+        <w:t xml:space="preserve">Consulted with clients and provided appropriate information regarding travel services routes reservations </w:t>
       </w:r>
     </w:p>
     <w:p>
       <w:pPr>
-        <w:jc w:val="center"/>
-      </w:pPr>
-      <w:r>
-        <w:rPr>
-          <w:b/>
-          <w:sz w:val="28"/>
-        </w:rPr>
-        <w:t>--- Page 2 ---</w:t>
-      </w:r>
-    </w:p>
-    <w:p/>
-    <w:p>
-      <w:pPr>
+        <w:autoSpaceDN w:val="0"/>
+        <w:autoSpaceDE w:val="0"/>
+        <w:widowControl/>
+        <w:spacing w:line="222" w:lineRule="exact" w:before="36" w:after="0"/>
+        <w:ind w:left="720" w:right="0" w:firstLine="0"/>
         <w:jc w:val="left"/>
       </w:pPr>
       <w:r>
         <w:rPr>
-          <w:b/>
-          <w:sz w:val="28"/>
+          <w:rFonts w:ascii="Times New Roman" w:hAnsi="Times New Roman" w:eastAsia="Times New Roman"/>
+          <w:b w:val="0"/>
+          <w:i w:val="0"/>
+          <w:color w:val="000000"/>
+          <w:sz w:val="20"/>
         </w:rPr>
-        <w:t>Sr. Manager - Travel Consultant</w:t>
+        <w:t xml:space="preserve">schemes and other available services </w:t>
       </w:r>
     </w:p>
     <w:p>
       <w:pPr>
+        <w:autoSpaceDN w:val="0"/>
+        <w:tabs>
+          <w:tab w:pos="720" w:val="left"/>
+        </w:tabs>
+        <w:autoSpaceDE w:val="0"/>
+        <w:widowControl/>
+        <w:spacing w:line="224" w:lineRule="exact" w:before="40" w:after="0"/>
+        <w:ind w:left="360" w:right="0" w:firstLine="0"/>
         <w:jc w:val="left"/>
       </w:pPr>
       <w:r>
         <w:rPr>
-          <w:b/>
-          <w:sz w:val="28"/>
+          <w:rFonts w:ascii="Arial" w:hAnsi="Arial" w:eastAsia="Arial"/>
+          <w:b w:val="0"/>
+          <w:i w:val="0"/>
+          <w:color w:val="000000"/>
+          <w:sz w:val="20"/>
         </w:rPr>
-        <w:t>May 2010 – Aug 2019</w:t>
+        <w:t xml:space="preserve">• </w:t>
+      </w:r>
+      <w:r>
+        <w:tab/>
+      </w:r>
+      <w:r>
+        <w:rPr>
+          <w:rFonts w:ascii="Times New Roman" w:hAnsi="Times New Roman" w:eastAsia="Times New Roman"/>
+          <w:b w:val="0"/>
+          <w:i w:val="0"/>
+          <w:color w:val="000000"/>
+          <w:sz w:val="20"/>
+        </w:rPr>
+        <w:t xml:space="preserve">Arranged client approved travel plans through network of reputable vendors </w:t>
       </w:r>
     </w:p>
     <w:p>
       <w:pPr>
+        <w:autoSpaceDN w:val="0"/>
+        <w:tabs>
+          <w:tab w:pos="720" w:val="left"/>
+        </w:tabs>
+        <w:autoSpaceDE w:val="0"/>
+        <w:widowControl/>
+        <w:spacing w:line="224" w:lineRule="exact" w:before="112" w:after="0"/>
+        <w:ind w:left="360" w:right="0" w:firstLine="0"/>
         <w:jc w:val="left"/>
       </w:pPr>
       <w:r>
         <w:rPr>
-          <w:b/>
-          <w:sz w:val="28"/>
+          <w:rFonts w:ascii="Arial" w:hAnsi="Arial" w:eastAsia="Arial"/>
+          <w:b w:val="0"/>
+          <w:i w:val="0"/>
+          <w:color w:val="000000"/>
+          <w:sz w:val="20"/>
         </w:rPr>
-        <w:t>LEISURE TOURS &amp; TRAVELS, Ahmedabad</w:t>
+        <w:t xml:space="preserve">• </w:t>
       </w:r>
-    </w:p>
-    <w:p>
+      <w:r>
+        <w:tab/>
+      </w:r>
       <w:r>
         <w:rPr>
-          <w:sz w:val="24"/>
+          <w:rFonts w:ascii="Times New Roman" w:hAnsi="Times New Roman" w:eastAsia="Times New Roman"/>
+          <w:b w:val="0"/>
+          <w:i w:val="0"/>
+          <w:color w:val="000000"/>
+          <w:sz w:val="20"/>
         </w:rPr>
-        <w:t>•</w:t>
-      </w:r>
-    </w:p>
-    <w:p>
-      <w:r>
-        <w:rPr>
-          <w:sz w:val="24"/>
-        </w:rPr>
-        <w:t>Consulted with clients and provided appropriate information regarding travel services routes reservations</w:t>
-      </w:r>
-    </w:p>
-    <w:p>
-      <w:r>
-        <w:rPr>
-          <w:sz w:val="24"/>
-        </w:rPr>
-        <w:t>schemes and other available services</w:t>
-      </w:r>
-    </w:p>
-    <w:p>
-      <w:r>
-        <w:rPr>
-          <w:sz w:val="24"/>
-        </w:rPr>
-        <w:t>•</w:t>
-      </w:r>
-    </w:p>
-    <w:p>
-      <w:r>
-        <w:rPr>
-          <w:sz w:val="24"/>
-        </w:rPr>
-        <w:t>Arranged client approved travel plans through network of reputable vendors</w:t>
-      </w:r>
-    </w:p>
-    <w:p>
-      <w:r>
-        <w:rPr>
-          <w:sz w:val="24"/>
-        </w:rPr>
-        <w:t>•</w:t>
-      </w:r>
-    </w:p>
-    <w:p>
-      <w:r>
-        <w:rPr>
-          <w:sz w:val="24"/>
-        </w:rPr>
-        <w:t>Provide Domestic and International Ticketing as per the availability and client’s requirement.</w:t>
-      </w:r>
-    </w:p>
-    <w:p>
-      <w:r>
-        <w:rPr>
-          <w:sz w:val="24"/>
-        </w:rPr>
-        <w:t>•</w:t>
-      </w:r>
-    </w:p>
-    <w:p>
-      <w:r>
-        <w:rPr>
-          <w:sz w:val="24"/>
-        </w:rPr>
-        <w:t>Managed client inquiries and kept them updated on progress through a range of communication channels</w:t>
-      </w:r>
-    </w:p>
-    <w:p>
-      <w:r>
-        <w:rPr>
-          <w:sz w:val="24"/>
-        </w:rPr>
-        <w:t>•</w:t>
-      </w:r>
-    </w:p>
-    <w:p>
-      <w:r>
-        <w:rPr>
-          <w:sz w:val="24"/>
-        </w:rPr>
-        <w:t>Minimized stress on clients associated with travel arrangements</w:t>
-      </w:r>
-    </w:p>
-    <w:p>
-      <w:r>
-        <w:rPr>
-          <w:sz w:val="24"/>
-        </w:rPr>
-        <w:t>•</w:t>
-      </w:r>
-    </w:p>
-    <w:p>
-      <w:r>
-        <w:rPr>
-          <w:sz w:val="24"/>
-        </w:rPr>
-        <w:t>Managed daily office correspondence</w:t>
+        <w:t xml:space="preserve">Provide Domestic and International Ticketing as per the availability and client’s requirement. </w:t>
       </w:r>
     </w:p>
     <w:p>
       <w:pPr>
+        <w:autoSpaceDN w:val="0"/>
+        <w:tabs>
+          <w:tab w:pos="720" w:val="left"/>
+        </w:tabs>
+        <w:autoSpaceDE w:val="0"/>
+        <w:widowControl/>
+        <w:spacing w:line="222" w:lineRule="exact" w:before="46" w:after="0"/>
+        <w:ind w:left="360" w:right="0" w:firstLine="0"/>
         <w:jc w:val="left"/>
       </w:pPr>
       <w:r>
         <w:rPr>
-          <w:b/>
-          <w:sz w:val="28"/>
+          <w:rFonts w:ascii="Arial" w:hAnsi="Arial" w:eastAsia="Arial"/>
+          <w:b w:val="0"/>
+          <w:i w:val="0"/>
+          <w:color w:val="000000"/>
+          <w:sz w:val="20"/>
         </w:rPr>
-        <w:t>Travel Officer</w:t>
+        <w:t xml:space="preserve">• </w:t>
+      </w:r>
+      <w:r>
+        <w:tab/>
+      </w:r>
+      <w:r>
+        <w:rPr>
+          <w:rFonts w:ascii="Times New Roman" w:hAnsi="Times New Roman" w:eastAsia="Times New Roman"/>
+          <w:b w:val="0"/>
+          <w:i w:val="0"/>
+          <w:color w:val="000000"/>
+          <w:sz w:val="20"/>
+        </w:rPr>
+        <w:t xml:space="preserve">Managed client inquiries and kept them updated on progress through a range of communication channels </w:t>
       </w:r>
     </w:p>
     <w:p>
       <w:pPr>
+        <w:autoSpaceDN w:val="0"/>
+        <w:tabs>
+          <w:tab w:pos="720" w:val="left"/>
+        </w:tabs>
+        <w:autoSpaceDE w:val="0"/>
+        <w:widowControl/>
+        <w:spacing w:line="224" w:lineRule="exact" w:before="42" w:after="0"/>
+        <w:ind w:left="360" w:right="0" w:firstLine="0"/>
         <w:jc w:val="left"/>
       </w:pPr>
       <w:r>
         <w:rPr>
+          <w:rFonts w:ascii="Arial" w:hAnsi="Arial" w:eastAsia="Arial"/>
+          <w:b w:val="0"/>
+          <w:i w:val="0"/>
+          <w:color w:val="000000"/>
+          <w:sz w:val="20"/>
+        </w:rPr>
+        <w:t xml:space="preserve">• </w:t>
+      </w:r>
+      <w:r>
+        <w:tab/>
+      </w:r>
+      <w:r>
+        <w:rPr>
+          <w:rFonts w:ascii="Times New Roman" w:hAnsi="Times New Roman" w:eastAsia="Times New Roman"/>
+          <w:b w:val="0"/>
+          <w:i w:val="0"/>
+          <w:color w:val="000000"/>
+          <w:sz w:val="20"/>
+        </w:rPr>
+        <w:t xml:space="preserve">Minimized stress on clients associated with travel arrangements </w:t>
+      </w:r>
+    </w:p>
+    <w:p>
+      <w:pPr>
+        <w:autoSpaceDN w:val="0"/>
+        <w:tabs>
+          <w:tab w:pos="720" w:val="left"/>
+        </w:tabs>
+        <w:autoSpaceDE w:val="0"/>
+        <w:widowControl/>
+        <w:spacing w:line="224" w:lineRule="exact" w:before="42" w:after="0"/>
+        <w:ind w:left="360" w:right="0" w:firstLine="0"/>
+        <w:jc w:val="left"/>
+      </w:pPr>
+      <w:r>
+        <w:rPr>
+          <w:rFonts w:ascii="Arial" w:hAnsi="Arial" w:eastAsia="Arial"/>
+          <w:b w:val="0"/>
+          <w:i w:val="0"/>
+          <w:color w:val="000000"/>
+          <w:sz w:val="20"/>
+        </w:rPr>
+        <w:t xml:space="preserve">• </w:t>
+      </w:r>
+      <w:r>
+        <w:tab/>
+      </w:r>
+      <w:r>
+        <w:rPr>
+          <w:rFonts w:ascii="Times New Roman" w:hAnsi="Times New Roman" w:eastAsia="Times New Roman"/>
+          <w:b w:val="0"/>
+          <w:i w:val="0"/>
+          <w:color w:val="000000"/>
+          <w:sz w:val="20"/>
+        </w:rPr>
+        <w:t xml:space="preserve">Managed daily office correspondence </w:t>
+      </w:r>
+    </w:p>
+    <w:p>
+      <w:pPr>
+        <w:autoSpaceDN w:val="0"/>
+        <w:tabs>
+          <w:tab w:pos="6922" w:val="left"/>
+        </w:tabs>
+        <w:autoSpaceDE w:val="0"/>
+        <w:widowControl/>
+        <w:spacing w:line="246" w:lineRule="exact" w:before="508" w:after="0"/>
+        <w:ind w:left="256" w:right="0" w:firstLine="0"/>
+        <w:jc w:val="left"/>
+      </w:pPr>
+      <w:r>
+        <w:rPr>
+          <w:rFonts w:ascii="Times New Roman,Bold" w:hAnsi="Times New Roman,Bold" w:eastAsia="Times New Roman,Bold"/>
           <w:b/>
-          <w:sz w:val="28"/>
+          <w:i w:val="0"/>
+          <w:color w:val="000000"/>
+          <w:sz w:val="22"/>
+        </w:rPr>
+        <w:t>Travel</w:t>
+      </w:r>
+      <w:r>
+        <w:rPr>
+          <w:rFonts w:ascii="Times New Roman,Bold" w:hAnsi="Times New Roman,Bold" w:eastAsia="Times New Roman,Bold"/>
+          <w:b/>
+          <w:i w:val="0"/>
+          <w:color w:val="000000"/>
+          <w:sz w:val="22"/>
+        </w:rPr>
+        <w:t xml:space="preserve">Officer </w:t>
+      </w:r>
+      <w:r>
+        <w:rPr>
+          <w:rFonts w:ascii="Times New Roman,Bold" w:hAnsi="Times New Roman,Bold" w:eastAsia="Times New Roman,Bold"/>
+          <w:b/>
+          <w:i w:val="0"/>
+          <w:color w:val="000000"/>
+          <w:sz w:val="22"/>
         </w:rPr>
         <w:t>May 2009 – April 2010</w:t>
       </w:r>
     </w:p>
     <w:p>
       <w:pPr>
+        <w:autoSpaceDN w:val="0"/>
+        <w:autoSpaceDE w:val="0"/>
+        <w:widowControl/>
+        <w:spacing w:line="244" w:lineRule="exact" w:before="28" w:after="0"/>
+        <w:ind w:left="242" w:right="0" w:firstLine="0"/>
         <w:jc w:val="left"/>
       </w:pPr>
       <w:r>
         <w:rPr>
+          <w:rFonts w:ascii="Times New Roman,Bold" w:hAnsi="Times New Roman,Bold" w:eastAsia="Times New Roman,Bold"/>
           <w:b/>
-          <w:sz w:val="28"/>
+          <w:i w:val="0"/>
+          <w:color w:val="000000"/>
+          <w:sz w:val="22"/>
         </w:rPr>
-        <w:t>GREEN CHANNEL TRAVEL SERVICES, Ahmedabad</w:t>
+        <w:t>GREEN</w:t>
       </w:r>
-    </w:p>
-    <w:p>
       <w:r>
         <w:rPr>
-          <w:sz w:val="24"/>
+          <w:rFonts w:ascii="Times New Roman,Bold" w:hAnsi="Times New Roman,Bold" w:eastAsia="Times New Roman,Bold"/>
+          <w:b/>
+          <w:i w:val="0"/>
+          <w:color w:val="000000"/>
+          <w:sz w:val="22"/>
         </w:rPr>
-        <w:t>•</w:t>
+        <w:t>CHANNEL</w:t>
       </w:r>
-    </w:p>
-    <w:p>
       <w:r>
         <w:rPr>
-          <w:sz w:val="24"/>
+          <w:rFonts w:ascii="Times New Roman,Bold" w:hAnsi="Times New Roman,Bold" w:eastAsia="Times New Roman,Bold"/>
+          <w:b/>
+          <w:i w:val="0"/>
+          <w:color w:val="000000"/>
+          <w:sz w:val="22"/>
         </w:rPr>
-        <w:t>Handling queries using Galelio &amp; Amadeus systems</w:t>
+        <w:t>TRAVEL</w:t>
       </w:r>
-    </w:p>
-    <w:p>
       <w:r>
         <w:rPr>
-          <w:sz w:val="24"/>
+          <w:rFonts w:ascii="Times New Roman,Bold" w:hAnsi="Times New Roman,Bold" w:eastAsia="Times New Roman,Bold"/>
+          <w:b/>
+          <w:i w:val="0"/>
+          <w:color w:val="000000"/>
+          <w:sz w:val="22"/>
         </w:rPr>
-        <w:t>•</w:t>
-      </w:r>
-    </w:p>
-    <w:p>
-      <w:r>
-        <w:rPr>
-          <w:sz w:val="24"/>
-        </w:rPr>
-        <w:t>Handle Domestic Flight booking</w:t>
-      </w:r>
-    </w:p>
-    <w:p>
-      <w:r>
-        <w:rPr>
-          <w:sz w:val="24"/>
-        </w:rPr>
-        <w:t>•</w:t>
-      </w:r>
-    </w:p>
-    <w:p>
-      <w:r>
-        <w:rPr>
-          <w:sz w:val="24"/>
-        </w:rPr>
-        <w:t>Providing Transport facility within the located region</w:t>
+        <w:t>SERVICES, Ahmedabad</w:t>
       </w:r>
     </w:p>
     <w:p>
       <w:pPr>
+        <w:autoSpaceDN w:val="0"/>
+        <w:tabs>
+          <w:tab w:pos="720" w:val="left"/>
+        </w:tabs>
+        <w:autoSpaceDE w:val="0"/>
+        <w:widowControl/>
+        <w:spacing w:line="224" w:lineRule="exact" w:before="20" w:after="0"/>
+        <w:ind w:left="360" w:right="0" w:firstLine="0"/>
         <w:jc w:val="left"/>
       </w:pPr>
       <w:r>
         <w:rPr>
-          <w:b/>
-          <w:sz w:val="28"/>
+          <w:rFonts w:ascii="Arial" w:hAnsi="Arial" w:eastAsia="Arial"/>
+          <w:b w:val="0"/>
+          <w:i w:val="0"/>
+          <w:color w:val="000000"/>
+          <w:sz w:val="20"/>
         </w:rPr>
-        <w:t>Counter Staff</w:t>
+        <w:t xml:space="preserve">• </w:t>
+      </w:r>
+      <w:r>
+        <w:tab/>
+      </w:r>
+      <w:r>
+        <w:rPr>
+          <w:rFonts w:ascii="Times New Roman" w:hAnsi="Times New Roman" w:eastAsia="Times New Roman"/>
+          <w:b w:val="0"/>
+          <w:i w:val="0"/>
+          <w:color w:val="000000"/>
+          <w:sz w:val="20"/>
+        </w:rPr>
+        <w:t xml:space="preserve">Handling queries using Galelio &amp; Amadeus systems </w:t>
       </w:r>
     </w:p>
     <w:p>
       <w:pPr>
+        <w:autoSpaceDN w:val="0"/>
+        <w:tabs>
+          <w:tab w:pos="720" w:val="left"/>
+        </w:tabs>
+        <w:autoSpaceDE w:val="0"/>
+        <w:widowControl/>
+        <w:spacing w:line="222" w:lineRule="exact" w:before="44" w:after="0"/>
+        <w:ind w:left="360" w:right="0" w:firstLine="0"/>
         <w:jc w:val="left"/>
       </w:pPr>
       <w:r>
         <w:rPr>
+          <w:rFonts w:ascii="Arial" w:hAnsi="Arial" w:eastAsia="Arial"/>
+          <w:b w:val="0"/>
+          <w:i w:val="0"/>
+          <w:color w:val="000000"/>
+          <w:sz w:val="20"/>
+        </w:rPr>
+        <w:t xml:space="preserve">• </w:t>
+      </w:r>
+      <w:r>
+        <w:tab/>
+      </w:r>
+      <w:r>
+        <w:rPr>
+          <w:rFonts w:ascii="Times New Roman" w:hAnsi="Times New Roman" w:eastAsia="Times New Roman"/>
+          <w:b w:val="0"/>
+          <w:i w:val="0"/>
+          <w:color w:val="000000"/>
+          <w:sz w:val="20"/>
+        </w:rPr>
+        <w:t xml:space="preserve">Handle Domestic Flight booking </w:t>
+      </w:r>
+    </w:p>
+    <w:p>
+      <w:pPr>
+        <w:autoSpaceDN w:val="0"/>
+        <w:tabs>
+          <w:tab w:pos="720" w:val="left"/>
+        </w:tabs>
+        <w:autoSpaceDE w:val="0"/>
+        <w:widowControl/>
+        <w:spacing w:line="224" w:lineRule="exact" w:before="44" w:after="0"/>
+        <w:ind w:left="360" w:right="0" w:firstLine="0"/>
+        <w:jc w:val="left"/>
+      </w:pPr>
+      <w:r>
+        <w:rPr>
+          <w:rFonts w:ascii="Arial" w:hAnsi="Arial" w:eastAsia="Arial"/>
+          <w:b w:val="0"/>
+          <w:i w:val="0"/>
+          <w:color w:val="000000"/>
+          <w:sz w:val="20"/>
+        </w:rPr>
+        <w:t xml:space="preserve">• </w:t>
+      </w:r>
+      <w:r>
+        <w:tab/>
+      </w:r>
+      <w:r>
+        <w:rPr>
+          <w:rFonts w:ascii="Times New Roman" w:hAnsi="Times New Roman" w:eastAsia="Times New Roman"/>
+          <w:b w:val="0"/>
+          <w:i w:val="0"/>
+          <w:color w:val="000000"/>
+          <w:sz w:val="20"/>
+        </w:rPr>
+        <w:t xml:space="preserve">Providing Transport facility within the located region </w:t>
+      </w:r>
+    </w:p>
+    <w:p>
+      <w:pPr>
+        <w:autoSpaceDN w:val="0"/>
+        <w:tabs>
+          <w:tab w:pos="6922" w:val="left"/>
+        </w:tabs>
+        <w:autoSpaceDE w:val="0"/>
+        <w:widowControl/>
+        <w:spacing w:line="246" w:lineRule="exact" w:before="496" w:after="0"/>
+        <w:ind w:left="256" w:right="0" w:firstLine="0"/>
+        <w:jc w:val="left"/>
+      </w:pPr>
+      <w:r>
+        <w:rPr>
+          <w:rFonts w:ascii="Times New Roman,Bold" w:hAnsi="Times New Roman,Bold" w:eastAsia="Times New Roman,Bold"/>
           <w:b/>
-          <w:sz w:val="28"/>
+          <w:i w:val="0"/>
+          <w:color w:val="000000"/>
+          <w:sz w:val="22"/>
+        </w:rPr>
+        <w:t>Counter</w:t>
+      </w:r>
+      <w:r>
+        <w:rPr>
+          <w:rFonts w:ascii="Times New Roman,Bold" w:hAnsi="Times New Roman,Bold" w:eastAsia="Times New Roman,Bold"/>
+          <w:b/>
+          <w:i w:val="0"/>
+          <w:color w:val="000000"/>
+          <w:sz w:val="22"/>
+        </w:rPr>
+        <w:t xml:space="preserve">Staff </w:t>
+      </w:r>
+      <w:r>
+        <w:rPr>
+          <w:rFonts w:ascii="Times New Roman,Bold" w:hAnsi="Times New Roman,Bold" w:eastAsia="Times New Roman,Bold"/>
+          <w:b/>
+          <w:i w:val="0"/>
+          <w:color w:val="000000"/>
+          <w:sz w:val="22"/>
         </w:rPr>
         <w:t>May 2008 – April 2009</w:t>
       </w:r>
     </w:p>
     <w:p>
       <w:pPr>
+        <w:autoSpaceDN w:val="0"/>
+        <w:autoSpaceDE w:val="0"/>
+        <w:widowControl/>
+        <w:spacing w:line="244" w:lineRule="exact" w:before="26" w:after="0"/>
+        <w:ind w:left="258" w:right="0" w:firstLine="0"/>
         <w:jc w:val="left"/>
       </w:pPr>
       <w:r>
         <w:rPr>
+          <w:rFonts w:ascii="Times New Roman,Bold" w:hAnsi="Times New Roman,Bold" w:eastAsia="Times New Roman,Bold"/>
           <w:b/>
-          <w:sz w:val="28"/>
+          <w:i w:val="0"/>
+          <w:color w:val="000000"/>
+          <w:sz w:val="22"/>
         </w:rPr>
-        <w:t>FAIRDEAL TRAVELS, Ahmedabad</w:t>
-      </w:r>
-    </w:p>
-    <w:p>
-      <w:r>
-        <w:rPr>
-          <w:sz w:val="24"/>
-        </w:rPr>
-        <w:t>•</w:t>
-      </w:r>
-    </w:p>
-    <w:p>
-      <w:r>
-        <w:rPr>
-          <w:sz w:val="24"/>
-        </w:rPr>
-        <w:t>Booking Flight tickets to the customers</w:t>
-      </w:r>
-    </w:p>
-    <w:p>
-      <w:r>
-        <w:rPr>
-          <w:sz w:val="24"/>
-        </w:rPr>
-        <w:t>•</w:t>
-      </w:r>
-    </w:p>
-    <w:p>
-      <w:r>
-        <w:rPr>
-          <w:sz w:val="24"/>
-        </w:rPr>
-        <w:t>Handling financial queries for the clients</w:t>
-      </w:r>
-    </w:p>
-    <w:p>
-      <w:r>
-        <w:rPr>
-          <w:sz w:val="24"/>
-        </w:rPr>
-        <w:t>•</w:t>
-      </w:r>
-    </w:p>
-    <w:p>
-      <w:r>
-        <w:rPr>
-          <w:sz w:val="24"/>
-        </w:rPr>
-        <w:t>Handling receipts, payments, petty cash, etc..,</w:t>
+        <w:t xml:space="preserve">FAIRDEAL TRAVELS, Ahmedabad </w:t>
       </w:r>
     </w:p>
     <w:p>
       <w:pPr>
+        <w:autoSpaceDN w:val="0"/>
+        <w:tabs>
+          <w:tab w:pos="720" w:val="left"/>
+        </w:tabs>
+        <w:autoSpaceDE w:val="0"/>
+        <w:widowControl/>
+        <w:spacing w:line="224" w:lineRule="exact" w:before="20" w:after="0"/>
+        <w:ind w:left="360" w:right="0" w:firstLine="0"/>
         <w:jc w:val="left"/>
       </w:pPr>
       <w:r>
         <w:rPr>
-          <w:b/>
-          <w:sz w:val="28"/>
+          <w:rFonts w:ascii="Arial" w:hAnsi="Arial" w:eastAsia="Arial"/>
+          <w:b w:val="0"/>
+          <w:i w:val="0"/>
+          <w:color w:val="000000"/>
+          <w:sz w:val="20"/>
         </w:rPr>
-        <w:t>Technical Qualifications:</w:t>
+        <w:t xml:space="preserve">• </w:t>
+      </w:r>
+      <w:r>
+        <w:tab/>
+      </w:r>
+      <w:r>
+        <w:rPr>
+          <w:rFonts w:ascii="Times New Roman" w:hAnsi="Times New Roman" w:eastAsia="Times New Roman"/>
+          <w:b w:val="0"/>
+          <w:i w:val="0"/>
+          <w:color w:val="000000"/>
+          <w:sz w:val="20"/>
+        </w:rPr>
+        <w:t xml:space="preserve">Booking Flight tickets to the customers </w:t>
       </w:r>
     </w:p>
     <w:p>
       <w:pPr>
+        <w:autoSpaceDN w:val="0"/>
+        <w:tabs>
+          <w:tab w:pos="720" w:val="left"/>
+        </w:tabs>
+        <w:autoSpaceDE w:val="0"/>
+        <w:widowControl/>
+        <w:spacing w:line="224" w:lineRule="exact" w:before="42" w:after="0"/>
+        <w:ind w:left="360" w:right="0" w:firstLine="0"/>
         <w:jc w:val="left"/>
       </w:pPr>
       <w:r>
         <w:rPr>
-          <w:b/>
-          <w:sz w:val="28"/>
+          <w:rFonts w:ascii="Arial" w:hAnsi="Arial" w:eastAsia="Arial"/>
+          <w:b w:val="0"/>
+          <w:i w:val="0"/>
+          <w:color w:val="000000"/>
+          <w:sz w:val="20"/>
         </w:rPr>
-        <w:t>Technical Qualification IATA / UFTAA FOUNDATION &amp; EBT</w:t>
+        <w:t xml:space="preserve">• </w:t>
+      </w:r>
+      <w:r>
+        <w:tab/>
+      </w:r>
+      <w:r>
+        <w:rPr>
+          <w:rFonts w:ascii="Times New Roman" w:hAnsi="Times New Roman" w:eastAsia="Times New Roman"/>
+          <w:b w:val="0"/>
+          <w:i w:val="0"/>
+          <w:color w:val="000000"/>
+          <w:sz w:val="20"/>
+        </w:rPr>
+        <w:t xml:space="preserve">Handling financial queries for the clients </w:t>
       </w:r>
     </w:p>
     <w:p>
       <w:pPr>
+        <w:autoSpaceDN w:val="0"/>
+        <w:tabs>
+          <w:tab w:pos="720" w:val="left"/>
+        </w:tabs>
+        <w:autoSpaceDE w:val="0"/>
+        <w:widowControl/>
+        <w:spacing w:line="222" w:lineRule="exact" w:before="44" w:after="0"/>
+        <w:ind w:left="360" w:right="0" w:firstLine="0"/>
         <w:jc w:val="left"/>
       </w:pPr>
       <w:r>
         <w:rPr>
+          <w:rFonts w:ascii="Arial" w:hAnsi="Arial" w:eastAsia="Arial"/>
+          <w:b w:val="0"/>
+          <w:i w:val="0"/>
+          <w:color w:val="000000"/>
+          <w:sz w:val="20"/>
+        </w:rPr>
+        <w:t xml:space="preserve">• </w:t>
+      </w:r>
+      <w:r>
+        <w:tab/>
+      </w:r>
+      <w:r>
+        <w:rPr>
+          <w:rFonts w:ascii="Times New Roman" w:hAnsi="Times New Roman" w:eastAsia="Times New Roman"/>
+          <w:b w:val="0"/>
+          <w:i w:val="0"/>
+          <w:color w:val="000000"/>
+          <w:sz w:val="20"/>
+        </w:rPr>
+        <w:t xml:space="preserve">Handling receipts, payments, petty cash, etc.., </w:t>
+      </w:r>
+    </w:p>
+    <w:p>
+      <w:pPr>
+        <w:autoSpaceDN w:val="0"/>
+        <w:autoSpaceDE w:val="0"/>
+        <w:widowControl/>
+        <w:spacing w:line="240" w:lineRule="auto" w:before="92" w:after="0"/>
+        <w:ind w:left="0" w:right="0" w:firstLine="0"/>
+        <w:jc w:val="left"/>
+      </w:pPr>
+      <w:r>
+        <w:drawing>
+          <wp:inline xmlns:a="http://schemas.openxmlformats.org/drawingml/2006/main" xmlns:pic="http://schemas.openxmlformats.org/drawingml/2006/picture">
+            <wp:extent cx="5768339" cy="138430"/>
+            <wp:docPr id="4" name="Picture 4"/>
+            <wp:cNvGraphicFramePr>
+              <a:graphicFrameLocks noChangeAspect="1"/>
+            </wp:cNvGraphicFramePr>
+            <a:graphic>
+              <a:graphicData uri="http://schemas.openxmlformats.org/drawingml/2006/picture">
+                <pic:pic>
+                  <pic:nvPicPr>
+                    <pic:cNvPr id="0" name="image.png"/>
+                    <pic:cNvPicPr/>
+                  </pic:nvPicPr>
+                  <pic:blipFill>
+                    <a:blip r:embed="rId12"/>
+                    <a:stretch>
+                      <a:fillRect/>
+                    </a:stretch>
+                  </pic:blipFill>
+                  <pic:spPr>
+                    <a:xfrm>
+                      <a:off x="0" y="0"/>
+                      <a:ext cx="5768339" cy="138430"/>
+                    </a:xfrm>
+                    <a:prstGeom prst="rect"/>
+                  </pic:spPr>
+                </pic:pic>
+              </a:graphicData>
+            </a:graphic>
+          </wp:inline>
+        </w:drawing>
+      </w:r>
+    </w:p>
+    <w:p>
+      <w:pPr>
+        <w:autoSpaceDN w:val="0"/>
+        <w:autoSpaceDE w:val="0"/>
+        <w:widowControl/>
+        <w:spacing w:line="264" w:lineRule="exact" w:before="32" w:after="0"/>
+        <w:ind w:left="0" w:right="0" w:firstLine="0"/>
+        <w:jc w:val="left"/>
+      </w:pPr>
+      <w:r>
+        <w:rPr>
+          <w:rFonts w:ascii="Times New Roman,Bold" w:hAnsi="Times New Roman,Bold" w:eastAsia="Times New Roman,Bold"/>
           <w:b/>
-          <w:sz w:val="28"/>
+          <w:i w:val="0"/>
+          <w:color w:val="000000"/>
+          <w:sz w:val="24"/>
+        </w:rPr>
+        <w:t xml:space="preserve">Technical Qualifications: </w:t>
+      </w:r>
+    </w:p>
+    <w:p>
+      <w:pPr>
+        <w:autoSpaceDN w:val="0"/>
+        <w:tabs>
+          <w:tab w:pos="6932" w:val="left"/>
+        </w:tabs>
+        <w:autoSpaceDE w:val="0"/>
+        <w:widowControl/>
+        <w:spacing w:line="254" w:lineRule="exact" w:before="32" w:after="0"/>
+        <w:ind w:left="256" w:right="0" w:firstLine="0"/>
+        <w:jc w:val="left"/>
+      </w:pPr>
+      <w:r>
+        <w:rPr>
+          <w:rFonts w:ascii="Times New Roman,Bold" w:hAnsi="Times New Roman,Bold" w:eastAsia="Times New Roman,Bold"/>
+          <w:b/>
+          <w:i w:val="0"/>
+          <w:color w:val="000000"/>
+          <w:sz w:val="23"/>
+        </w:rPr>
+        <w:t xml:space="preserve">Technical Qualification </w:t>
+      </w:r>
+      <w:r>
+        <w:rPr>
+          <w:rFonts w:ascii="Times New Roman,Bold" w:hAnsi="Times New Roman,Bold" w:eastAsia="Times New Roman,Bold"/>
+          <w:b/>
+          <w:i w:val="0"/>
+          <w:color w:val="000000"/>
+          <w:sz w:val="22"/>
+        </w:rPr>
+        <w:t xml:space="preserve">IATA / UFTAA FOUNDATION &amp; EBT </w:t>
+      </w:r>
+      <w:r>
+        <w:rPr>
+          <w:rFonts w:ascii="Times New Roman,Bold" w:hAnsi="Times New Roman,Bold" w:eastAsia="Times New Roman,Bold"/>
+          <w:b/>
+          <w:i w:val="0"/>
+          <w:color w:val="000000"/>
+          <w:sz w:val="22"/>
+        </w:rPr>
+        <w:t>Mar -</w:t>
+      </w:r>
+      <w:r>
+        <w:rPr>
+          <w:rFonts w:ascii="Times New Roman,Bold" w:hAnsi="Times New Roman,Bold" w:eastAsia="Times New Roman,Bold"/>
+          <w:b/>
+          <w:i w:val="0"/>
+          <w:color w:val="000000"/>
+          <w:sz w:val="22"/>
+        </w:rPr>
+        <w:t>2008</w:t>
+      </w:r>
+    </w:p>
+    <w:p>
+      <w:pPr>
+        <w:autoSpaceDN w:val="0"/>
+        <w:autoSpaceDE w:val="0"/>
+        <w:widowControl/>
+        <w:spacing w:line="246" w:lineRule="exact" w:before="32" w:after="0"/>
+        <w:ind w:left="256" w:right="0" w:firstLine="0"/>
+        <w:jc w:val="left"/>
+      </w:pPr>
+      <w:r>
+        <w:rPr>
+          <w:rFonts w:ascii="Times New Roman,Bold" w:hAnsi="Times New Roman,Bold" w:eastAsia="Times New Roman,Bold"/>
+          <w:b/>
+          <w:i w:val="0"/>
+          <w:color w:val="000000"/>
+          <w:sz w:val="22"/>
         </w:rPr>
         <w:t>COURSE</w:t>
       </w:r>
     </w:p>
     <w:p>
       <w:pPr>
+        <w:autoSpaceDN w:val="0"/>
+        <w:tabs>
+          <w:tab w:pos="6932" w:val="left"/>
+        </w:tabs>
+        <w:autoSpaceDE w:val="0"/>
+        <w:widowControl/>
+        <w:spacing w:line="254" w:lineRule="exact" w:before="28" w:after="0"/>
+        <w:ind w:left="256" w:right="0" w:firstLine="0"/>
         <w:jc w:val="left"/>
       </w:pPr>
       <w:r>
         <w:rPr>
+          <w:rFonts w:ascii="Times New Roman,Bold" w:hAnsi="Times New Roman,Bold" w:eastAsia="Times New Roman,Bold"/>
           <w:b/>
-          <w:sz w:val="28"/>
+          <w:i w:val="0"/>
+          <w:color w:val="000000"/>
+          <w:sz w:val="23"/>
         </w:rPr>
-        <w:t>Mar - 2008</w:t>
+        <w:t>Amadeus</w:t>
+      </w:r>
+      <w:r>
+        <w:rPr>
+          <w:rFonts w:ascii="Times New Roman,Bold" w:hAnsi="Times New Roman,Bold" w:eastAsia="Times New Roman,Bold"/>
+          <w:b/>
+          <w:i w:val="0"/>
+          <w:color w:val="000000"/>
+          <w:sz w:val="23"/>
+        </w:rPr>
+        <w:t xml:space="preserve">Certified </w:t>
+      </w:r>
+      <w:r>
+        <w:rPr>
+          <w:rFonts w:ascii="Times New Roman,Bold" w:hAnsi="Times New Roman,Bold" w:eastAsia="Times New Roman,Bold"/>
+          <w:b/>
+          <w:i w:val="0"/>
+          <w:color w:val="000000"/>
+          <w:sz w:val="22"/>
+        </w:rPr>
+        <w:t>Oct</w:t>
+      </w:r>
+      <w:r>
+        <w:rPr>
+          <w:rFonts w:ascii="Times New Roman,Bold" w:hAnsi="Times New Roman,Bold" w:eastAsia="Times New Roman,Bold"/>
+          <w:b/>
+          <w:i w:val="0"/>
+          <w:color w:val="000000"/>
+          <w:sz w:val="22"/>
+        </w:rPr>
+        <w:t>-</w:t>
+      </w:r>
+      <w:r>
+        <w:rPr>
+          <w:rFonts w:ascii="Times New Roman,Bold" w:hAnsi="Times New Roman,Bold" w:eastAsia="Times New Roman,Bold"/>
+          <w:b/>
+          <w:i w:val="0"/>
+          <w:color w:val="000000"/>
+          <w:sz w:val="22"/>
+        </w:rPr>
+        <w:t>2025</w:t>
       </w:r>
     </w:p>
     <w:p>
       <w:pPr>
+        <w:autoSpaceDN w:val="0"/>
+        <w:autoSpaceDE w:val="0"/>
+        <w:widowControl/>
+        <w:spacing w:line="266" w:lineRule="exact" w:before="322" w:after="0"/>
+        <w:ind w:left="0" w:right="0" w:firstLine="0"/>
         <w:jc w:val="left"/>
       </w:pPr>
       <w:r>
         <w:rPr>
+          <w:rFonts w:ascii="Times New Roman,Bold" w:hAnsi="Times New Roman,Bold" w:eastAsia="Times New Roman,Bold"/>
           <w:b/>
-          <w:sz w:val="28"/>
-        </w:rPr>
-        <w:t>Amadeus Certified</w:t>
-      </w:r>
-    </w:p>
-    <w:p>
-      <w:pPr>
-        <w:jc w:val="left"/>
-      </w:pPr>
-      <w:r>
-        <w:rPr>
-          <w:b/>
-          <w:sz w:val="28"/>
-        </w:rPr>
-        <w:t>Oct - 2025</w:t>
-      </w:r>
-    </w:p>
-    <w:p>
-      <w:pPr>
-        <w:jc w:val="left"/>
-      </w:pPr>
-      <w:r>
-        <w:rPr>
-          <w:b/>
-          <w:sz w:val="28"/>
+          <w:i w:val="0"/>
+          <w:color w:val="000000"/>
+          <w:sz w:val="24"/>
         </w:rPr>
         <w:t>Education:</w:t>
       </w:r>
     </w:p>
     <w:p>
+      <w:pPr>
+        <w:autoSpaceDN w:val="0"/>
+        <w:tabs>
+          <w:tab w:pos="7078" w:val="left"/>
+        </w:tabs>
+        <w:autoSpaceDE w:val="0"/>
+        <w:widowControl/>
+        <w:spacing w:line="220" w:lineRule="exact" w:before="26" w:after="0"/>
+        <w:ind w:left="256" w:right="0" w:firstLine="0"/>
+        <w:jc w:val="left"/>
+      </w:pPr>
       <w:r>
         <w:rPr>
-          <w:sz w:val="24"/>
+          <w:rFonts w:ascii="Times New Roman" w:hAnsi="Times New Roman" w:eastAsia="Times New Roman"/>
+          <w:b w:val="0"/>
+          <w:i w:val="0"/>
+          <w:color w:val="000000"/>
+          <w:sz w:val="20"/>
         </w:rPr>
-        <w:t>BA in English</w:t>
+        <w:t xml:space="preserve">BA in English </w:t>
       </w:r>
-    </w:p>
-    <w:p>
+      <w:r>
+        <w:tab/>
+      </w:r>
       <w:r>
         <w:rPr>
-          <w:sz w:val="24"/>
+          <w:rFonts w:ascii="Times New Roman" w:hAnsi="Times New Roman" w:eastAsia="Times New Roman"/>
+          <w:b w:val="0"/>
+          <w:i w:val="0"/>
+          <w:color w:val="000000"/>
+          <w:sz w:val="20"/>
         </w:rPr>
-        <w:t>Mar – 2008</w:t>
-      </w:r>
-    </w:p>
-    <w:p>
-      <w:r>
-        <w:rPr>
-          <w:sz w:val="24"/>
-        </w:rPr>
-        <w:t>12 th Science</w:t>
-      </w:r>
-    </w:p>
-    <w:p>
-      <w:r>
-        <w:rPr>
-          <w:sz w:val="24"/>
-        </w:rPr>
-        <w:t>Mar – 2005</w:t>
-      </w:r>
-    </w:p>
-    <w:p>
-      <w:r>
-        <w:rPr>
-          <w:sz w:val="24"/>
-        </w:rPr>
-        <w:t>10 th</w:t>
-      </w:r>
-    </w:p>
-    <w:p>
-      <w:r>
-        <w:rPr>
-          <w:sz w:val="24"/>
-        </w:rPr>
-        <w:t>Mar – 2002</w:t>
+        <w:t xml:space="preserve">Mar – 2008 </w:t>
       </w:r>
     </w:p>
     <w:p>
       <w:pPr>
+        <w:autoSpaceDN w:val="0"/>
+        <w:tabs>
+          <w:tab w:pos="7078" w:val="left"/>
+        </w:tabs>
+        <w:autoSpaceDE w:val="0"/>
+        <w:widowControl/>
+        <w:spacing w:line="228" w:lineRule="exact" w:before="42" w:after="0"/>
+        <w:ind w:left="256" w:right="0" w:firstLine="0"/>
         <w:jc w:val="left"/>
       </w:pPr>
       <w:r>
         <w:rPr>
-          <w:b/>
-          <w:sz w:val="28"/>
+          <w:rFonts w:ascii="Times New Roman" w:hAnsi="Times New Roman" w:eastAsia="Times New Roman"/>
+          <w:b w:val="0"/>
+          <w:i w:val="0"/>
+          <w:color w:val="000000"/>
+          <w:sz w:val="20"/>
         </w:rPr>
-        <w:t>Personal Details</w:t>
+        <w:t>12</w:t>
       </w:r>
-    </w:p>
-    <w:p>
       <w:r>
         <w:rPr>
-          <w:sz w:val="24"/>
+          <w:rFonts w:ascii="Times New Roman" w:hAnsi="Times New Roman" w:eastAsia="Times New Roman"/>
+          <w:b w:val="0"/>
+          <w:i w:val="0"/>
+          <w:color w:val="000000"/>
+          <w:sz w:val="13"/>
         </w:rPr>
-        <w:t>Husband Name</w:t>
+        <w:t>th</w:t>
       </w:r>
-    </w:p>
-    <w:p>
       <w:r>
         <w:rPr>
-          <w:sz w:val="24"/>
+          <w:rFonts w:ascii="Times New Roman" w:hAnsi="Times New Roman" w:eastAsia="Times New Roman"/>
+          <w:b w:val="0"/>
+          <w:i w:val="0"/>
+          <w:color w:val="000000"/>
+          <w:sz w:val="20"/>
         </w:rPr>
-        <w:t>MD IQBAL BASHA</w:t>
+        <w:t xml:space="preserve"> Science </w:t>
       </w:r>
-    </w:p>
-    <w:p>
+      <w:r>
+        <w:tab/>
+      </w:r>
       <w:r>
         <w:rPr>
-          <w:sz w:val="24"/>
+          <w:rFonts w:ascii="Times New Roman" w:hAnsi="Times New Roman" w:eastAsia="Times New Roman"/>
+          <w:b w:val="0"/>
+          <w:i w:val="0"/>
+          <w:color w:val="000000"/>
+          <w:sz w:val="20"/>
         </w:rPr>
-        <w:t>Marital Status</w:t>
-      </w:r>
-    </w:p>
-    <w:p>
-      <w:r>
-        <w:rPr>
-          <w:sz w:val="24"/>
-        </w:rPr>
-        <w:t>Married</w:t>
-      </w:r>
-    </w:p>
-    <w:p>
-      <w:r>
-        <w:rPr>
-          <w:sz w:val="24"/>
-        </w:rPr>
-        <w:t>Address</w:t>
-      </w:r>
-    </w:p>
-    <w:p>
-      <w:r>
-        <w:rPr>
-          <w:sz w:val="24"/>
-        </w:rPr>
-        <w:t>#229, Ground Floor, 5 th B Main Road,</w:t>
-      </w:r>
-    </w:p>
-    <w:p>
-      <w:r>
-        <w:rPr>
-          <w:sz w:val="24"/>
-        </w:rPr>
-        <w:t>2 nd Block, Near Banaswadi Traffic Police Station</w:t>
-      </w:r>
-    </w:p>
-    <w:p>
-      <w:r>
-        <w:rPr>
-          <w:sz w:val="24"/>
-        </w:rPr>
-        <w:t>Kalyan Nagar, Bangalore -43</w:t>
-      </w:r>
-    </w:p>
-    <w:p>
-      <w:r>
-        <w:rPr>
-          <w:sz w:val="24"/>
-        </w:rPr>
-        <w:t>Nationality</w:t>
-      </w:r>
-    </w:p>
-    <w:p>
-      <w:r>
-        <w:rPr>
-          <w:sz w:val="24"/>
-        </w:rPr>
-        <w:t>Indian – Muslim</w:t>
-      </w:r>
-    </w:p>
-    <w:p>
-      <w:r>
-        <w:rPr>
-          <w:sz w:val="24"/>
-        </w:rPr>
-        <w:t>Languages Known</w:t>
-      </w:r>
-    </w:p>
-    <w:p>
-      <w:r>
-        <w:rPr>
-          <w:sz w:val="24"/>
-        </w:rPr>
-        <w:t>English, Hindi &amp; Gujarati</w:t>
-      </w:r>
-    </w:p>
-    <w:p>
-      <w:r>
-        <w:t>==================================================</w:t>
+        <w:t xml:space="preserve">Mar – 2005 </w:t>
       </w:r>
     </w:p>
     <w:p>
       <w:pPr>
-        <w:jc w:val="center"/>
+        <w:autoSpaceDN w:val="0"/>
+        <w:tabs>
+          <w:tab w:pos="7078" w:val="left"/>
+        </w:tabs>
+        <w:autoSpaceDE w:val="0"/>
+        <w:widowControl/>
+        <w:spacing w:line="228" w:lineRule="exact" w:before="76" w:after="0"/>
+        <w:ind w:left="256" w:right="0" w:firstLine="0"/>
+        <w:jc w:val="left"/>
       </w:pPr>
       <w:r>
         <w:rPr>
-          <w:b/>
+          <w:rFonts w:ascii="Times New Roman" w:hAnsi="Times New Roman" w:eastAsia="Times New Roman"/>
+          <w:b w:val="0"/>
+          <w:i w:val="0"/>
+          <w:color w:val="000000"/>
           <w:sz w:val="20"/>
         </w:rPr>
-        <w:t>Conversion completed: 2 pages processed</w:t>
+        <w:t>10</w:t>
+      </w:r>
+      <w:r>
+        <w:rPr>
+          <w:rFonts w:ascii="Times New Roman" w:hAnsi="Times New Roman" w:eastAsia="Times New Roman"/>
+          <w:b w:val="0"/>
+          <w:i w:val="0"/>
+          <w:color w:val="000000"/>
+          <w:sz w:val="13"/>
+        </w:rPr>
+        <w:t xml:space="preserve">th </w:t>
+      </w:r>
+      <w:r>
+        <w:tab/>
+      </w:r>
+      <w:r>
+        <w:rPr>
+          <w:rFonts w:ascii="Times New Roman" w:hAnsi="Times New Roman" w:eastAsia="Times New Roman"/>
+          <w:b w:val="0"/>
+          <w:i w:val="0"/>
+          <w:color w:val="000000"/>
+          <w:sz w:val="20"/>
+        </w:rPr>
+        <w:t xml:space="preserve">Mar – 2002 </w:t>
+      </w:r>
+    </w:p>
+    <w:p>
+      <w:pPr>
+        <w:autoSpaceDN w:val="0"/>
+        <w:autoSpaceDE w:val="0"/>
+        <w:widowControl/>
+        <w:spacing w:line="266" w:lineRule="exact" w:before="628" w:after="0"/>
+        <w:ind w:left="106" w:right="0" w:firstLine="0"/>
+        <w:jc w:val="left"/>
+      </w:pPr>
+      <w:r>
+        <w:rPr>
+          <w:rFonts w:ascii="Times New Roman,Bold" w:hAnsi="Times New Roman,Bold" w:eastAsia="Times New Roman,Bold"/>
+          <w:b/>
+          <w:i w:val="0"/>
+          <w:color w:val="000000"/>
+          <w:sz w:val="24"/>
+        </w:rPr>
+        <w:t>Personal</w:t>
+      </w:r>
+      <w:r>
+        <w:rPr>
+          <w:rFonts w:ascii="Times New Roman,Bold" w:hAnsi="Times New Roman,Bold" w:eastAsia="Times New Roman,Bold"/>
+          <w:b/>
+          <w:i w:val="0"/>
+          <w:color w:val="000000"/>
+          <w:sz w:val="24"/>
+        </w:rPr>
+        <w:t>Details</w:t>
+      </w:r>
+    </w:p>
+    <w:p>
+      <w:pPr>
+        <w:autoSpaceDN w:val="0"/>
+        <w:tabs>
+          <w:tab w:pos="4768" w:val="left"/>
+        </w:tabs>
+        <w:autoSpaceDE w:val="0"/>
+        <w:widowControl/>
+        <w:spacing w:line="220" w:lineRule="exact" w:before="70" w:after="0"/>
+        <w:ind w:left="256" w:right="0" w:firstLine="0"/>
+        <w:jc w:val="left"/>
+      </w:pPr>
+      <w:r>
+        <w:rPr>
+          <w:rFonts w:ascii="Times New Roman" w:hAnsi="Times New Roman" w:eastAsia="Times New Roman"/>
+          <w:b w:val="0"/>
+          <w:i w:val="0"/>
+          <w:color w:val="000000"/>
+          <w:sz w:val="20"/>
+        </w:rPr>
+        <w:t xml:space="preserve">Husband Name </w:t>
+      </w:r>
+      <w:r>
+        <w:tab/>
+      </w:r>
+      <w:r>
+        <w:rPr>
+          <w:rFonts w:ascii="Times New Roman" w:hAnsi="Times New Roman" w:eastAsia="Times New Roman"/>
+          <w:b w:val="0"/>
+          <w:i w:val="0"/>
+          <w:color w:val="000000"/>
+          <w:sz w:val="20"/>
+        </w:rPr>
+        <w:t xml:space="preserve">MD IQBAL BASHA </w:t>
+      </w:r>
+    </w:p>
+    <w:p>
+      <w:pPr>
+        <w:autoSpaceDN w:val="0"/>
+        <w:tabs>
+          <w:tab w:pos="4768" w:val="left"/>
+        </w:tabs>
+        <w:autoSpaceDE w:val="0"/>
+        <w:widowControl/>
+        <w:spacing w:line="220" w:lineRule="exact" w:before="38" w:after="0"/>
+        <w:ind w:left="256" w:right="0" w:firstLine="0"/>
+        <w:jc w:val="left"/>
+      </w:pPr>
+      <w:r>
+        <w:rPr>
+          <w:rFonts w:ascii="Times New Roman" w:hAnsi="Times New Roman" w:eastAsia="Times New Roman"/>
+          <w:b w:val="0"/>
+          <w:i w:val="0"/>
+          <w:color w:val="000000"/>
+          <w:sz w:val="20"/>
+        </w:rPr>
+        <w:t xml:space="preserve">Marital Status </w:t>
+      </w:r>
+      <w:r>
+        <w:tab/>
+      </w:r>
+      <w:r>
+        <w:rPr>
+          <w:rFonts w:ascii="Times New Roman" w:hAnsi="Times New Roman" w:eastAsia="Times New Roman"/>
+          <w:b w:val="0"/>
+          <w:i w:val="0"/>
+          <w:color w:val="000000"/>
+          <w:sz w:val="20"/>
+        </w:rPr>
+        <w:t xml:space="preserve">Married </w:t>
+      </w:r>
+    </w:p>
+    <w:p>
+      <w:pPr>
+        <w:autoSpaceDN w:val="0"/>
+        <w:tabs>
+          <w:tab w:pos="4768" w:val="left"/>
+        </w:tabs>
+        <w:autoSpaceDE w:val="0"/>
+        <w:widowControl/>
+        <w:spacing w:line="228" w:lineRule="exact" w:before="26" w:after="0"/>
+        <w:ind w:left="256" w:right="0" w:firstLine="0"/>
+        <w:jc w:val="left"/>
+      </w:pPr>
+      <w:r>
+        <w:rPr>
+          <w:rFonts w:ascii="Times New Roman" w:hAnsi="Times New Roman" w:eastAsia="Times New Roman"/>
+          <w:b w:val="0"/>
+          <w:i w:val="0"/>
+          <w:color w:val="000000"/>
+          <w:sz w:val="20"/>
+        </w:rPr>
+        <w:t xml:space="preserve">Address </w:t>
+      </w:r>
+      <w:r>
+        <w:tab/>
+      </w:r>
+      <w:r>
+        <w:rPr>
+          <w:rFonts w:ascii="Times New Roman" w:hAnsi="Times New Roman" w:eastAsia="Times New Roman"/>
+          <w:b w:val="0"/>
+          <w:i w:val="0"/>
+          <w:color w:val="000000"/>
+          <w:sz w:val="20"/>
+        </w:rPr>
+        <w:t>#229, Ground Floor, 5</w:t>
+      </w:r>
+      <w:r>
+        <w:rPr>
+          <w:rFonts w:ascii="Times New Roman" w:hAnsi="Times New Roman" w:eastAsia="Times New Roman"/>
+          <w:b w:val="0"/>
+          <w:i w:val="0"/>
+          <w:color w:val="000000"/>
+          <w:sz w:val="13"/>
+        </w:rPr>
+        <w:t>th</w:t>
+      </w:r>
+      <w:r>
+        <w:rPr>
+          <w:rFonts w:ascii="Times New Roman" w:hAnsi="Times New Roman" w:eastAsia="Times New Roman"/>
+          <w:b w:val="0"/>
+          <w:i w:val="0"/>
+          <w:color w:val="000000"/>
+          <w:sz w:val="20"/>
+        </w:rPr>
+        <w:t xml:space="preserve"> B Main Road, </w:t>
+      </w:r>
+    </w:p>
+    <w:p>
+      <w:pPr>
+        <w:autoSpaceDN w:val="0"/>
+        <w:autoSpaceDE w:val="0"/>
+        <w:widowControl/>
+        <w:spacing w:line="228" w:lineRule="exact" w:before="54" w:after="0"/>
+        <w:ind w:left="0" w:right="444" w:firstLine="0"/>
+        <w:jc w:val="right"/>
+      </w:pPr>
+      <w:r>
+        <w:rPr>
+          <w:rFonts w:ascii="Times New Roman" w:hAnsi="Times New Roman" w:eastAsia="Times New Roman"/>
+          <w:b w:val="0"/>
+          <w:i w:val="0"/>
+          <w:color w:val="000000"/>
+          <w:sz w:val="20"/>
+        </w:rPr>
+        <w:t>2</w:t>
+      </w:r>
+      <w:r>
+        <w:rPr>
+          <w:rFonts w:ascii="Times New Roman" w:hAnsi="Times New Roman" w:eastAsia="Times New Roman"/>
+          <w:b w:val="0"/>
+          <w:i w:val="0"/>
+          <w:color w:val="000000"/>
+          <w:sz w:val="13"/>
+        </w:rPr>
+        <w:t>nd</w:t>
+      </w:r>
+      <w:r>
+        <w:rPr>
+          <w:rFonts w:ascii="Times New Roman" w:hAnsi="Times New Roman" w:eastAsia="Times New Roman"/>
+          <w:b w:val="0"/>
+          <w:i w:val="0"/>
+          <w:color w:val="000000"/>
+          <w:sz w:val="20"/>
+        </w:rPr>
+        <w:t xml:space="preserve"> Block, Near Banaswadi Traffic Police Station </w:t>
+      </w:r>
+    </w:p>
+    <w:p>
+      <w:pPr>
+        <w:autoSpaceDN w:val="0"/>
+        <w:autoSpaceDE w:val="0"/>
+        <w:widowControl/>
+        <w:spacing w:line="222" w:lineRule="exact" w:before="70" w:after="0"/>
+        <w:ind w:left="0" w:right="2028" w:firstLine="0"/>
+        <w:jc w:val="right"/>
+      </w:pPr>
+      <w:r>
+        <w:rPr>
+          <w:rFonts w:ascii="Times New Roman" w:hAnsi="Times New Roman" w:eastAsia="Times New Roman"/>
+          <w:b w:val="0"/>
+          <w:i w:val="0"/>
+          <w:color w:val="000000"/>
+          <w:sz w:val="20"/>
+        </w:rPr>
+        <w:t xml:space="preserve">Kalyan Nagar, Bangalore -43 </w:t>
+      </w:r>
+    </w:p>
+    <w:p>
+      <w:pPr>
+        <w:autoSpaceDN w:val="0"/>
+        <w:tabs>
+          <w:tab w:pos="4768" w:val="left"/>
+        </w:tabs>
+        <w:autoSpaceDE w:val="0"/>
+        <w:widowControl/>
+        <w:spacing w:line="220" w:lineRule="exact" w:before="26" w:after="46"/>
+        <w:ind w:left="256" w:right="0" w:firstLine="0"/>
+        <w:jc w:val="left"/>
+      </w:pPr>
+      <w:r>
+        <w:rPr>
+          <w:rFonts w:ascii="Times New Roman" w:hAnsi="Times New Roman" w:eastAsia="Times New Roman"/>
+          <w:b w:val="0"/>
+          <w:i w:val="0"/>
+          <w:color w:val="000000"/>
+          <w:sz w:val="20"/>
+        </w:rPr>
+        <w:t xml:space="preserve">Nationality </w:t>
+      </w:r>
+      <w:r>
+        <w:tab/>
+      </w:r>
+      <w:r>
+        <w:rPr>
+          <w:rFonts w:ascii="Times New Roman" w:hAnsi="Times New Roman" w:eastAsia="Times New Roman"/>
+          <w:b w:val="0"/>
+          <w:i w:val="0"/>
+          <w:color w:val="000000"/>
+          <w:sz w:val="20"/>
+        </w:rPr>
+        <w:t xml:space="preserve">Indian – Muslim </w:t>
+      </w:r>
+    </w:p>
+    <w:p>
+      <w:pPr>
+        <w:sectPr>
+          <w:pgSz w:w="11906" w:h="16838"/>
+          <w:pgMar w:top="730" w:right="1412" w:bottom="1440" w:left="1292" w:header="720" w:footer="720" w:gutter="0"/>
+          <w:cols/>
+          <w:docGrid w:linePitch="360"/>
+        </w:sectPr>
+      </w:pPr>
+    </w:p>
+    <w:p>
+      <w:pPr>
+        <w:autoSpaceDN w:val="0"/>
+        <w:autoSpaceDE w:val="0"/>
+        <w:widowControl/>
+        <w:spacing w:line="222" w:lineRule="exact" w:before="0" w:after="0"/>
+        <w:ind w:left="256" w:right="0" w:firstLine="0"/>
+        <w:jc w:val="left"/>
+      </w:pPr>
+      <w:r>
+        <w:rPr>
+          <w:rFonts w:ascii="Times New Roman" w:hAnsi="Times New Roman" w:eastAsia="Times New Roman"/>
+          <w:b w:val="0"/>
+          <w:i w:val="0"/>
+          <w:color w:val="000000"/>
+          <w:sz w:val="20"/>
+        </w:rPr>
+        <w:t xml:space="preserve">Languages Known </w:t>
+      </w:r>
+    </w:p>
+    <w:p>
+      <w:pPr>
+        <w:sectPr>
+          <w:type w:val="continuous"/>
+          <w:pgSz w:w="11906" w:h="16838"/>
+          <w:pgMar w:top="730" w:right="1412" w:bottom="1440" w:left="1292" w:header="720" w:footer="720" w:gutter="0"/>
+          <w:cols w:num="2" w:equalWidth="0">
+            <w:col w:w="3288" w:space="0"/>
+            <w:col w:w="5914" w:space="0"/>
+          </w:cols>
+          <w:docGrid w:linePitch="360"/>
+        </w:sectPr>
+      </w:pPr>
+    </w:p>
+    <w:p>
+      <w:pPr>
+        <w:autoSpaceDN w:val="0"/>
+        <w:autoSpaceDE w:val="0"/>
+        <w:widowControl/>
+        <w:spacing w:line="222" w:lineRule="exact" w:before="0" w:after="0"/>
+        <w:ind w:left="0" w:right="2308" w:firstLine="0"/>
+        <w:jc w:val="right"/>
+      </w:pPr>
+      <w:r>
+        <w:rPr>
+          <w:rFonts w:ascii="Times New Roman" w:hAnsi="Times New Roman" w:eastAsia="Times New Roman"/>
+          <w:b w:val="0"/>
+          <w:i w:val="0"/>
+          <w:color w:val="000000"/>
+          <w:sz w:val="20"/>
+        </w:rPr>
+        <w:t xml:space="preserve">English, Hindi &amp; Gujarati </w:t>
       </w:r>
     </w:p>
     <w:sectPr>
-      <w:pgSz w:w="12240" w:h="15840"/>
-      <w:pgMar w:top="1440" w:right="1800" w:bottom="1440" w:left="1800" w:header="720" w:footer="720" w:gutter="0"/>
-      <w:cols w:space="720"/>
+      <w:type w:val="nextColumn"/>
+      <w:pgSz w:w="11906" w:h="16838"/>
+      <w:pgMar w:top="730" w:right="1412" w:bottom="1440" w:left="1292" w:header="720" w:footer="720" w:gutter="0"/>
+      <w:cols w:num="2" w:equalWidth="0">
+        <w:col w:w="3288" w:space="0"/>
+        <w:col w:w="5914" w:space="0"/>
+      </w:cols>
       <w:docGrid w:linePitch="360"/>
     </w:sectPr>
   </w:body>

</xml_diff>